<commit_message>
docs(A1): add independent-verification table, source-conflict counterexample, AI verification instances
</commit_message>
<xml_diff>
--- a/docs/A1-草稿-中文-2026-09-27.docx
+++ b/docs/A1-草稿-中文-2026-09-27.docx
@@ -2,7 +2,7 @@
 <file path=word/document.xml><?xml version="1.0" encoding="utf-8"?>
 <w:document xmlns:w="http://schemas.openxmlformats.org/wordprocessingml/2006/main" xmlns:m="http://schemas.openxmlformats.org/officeDocument/2006/math" xmlns:r="http://schemas.openxmlformats.org/officeDocument/2006/relationships" xmlns:o="urn:schemas-microsoft-com:office:office" xmlns:v="urn:schemas-microsoft-com:vml" xmlns:w10="urn:schemas-microsoft-com:office:word" xmlns:a="http://schemas.openxmlformats.org/drawingml/2006/main" xmlns:pic="http://schemas.openxmlformats.org/drawingml/2006/picture" xmlns:wp="http://schemas.openxmlformats.org/drawingml/2006/wordprocessingDrawing">
   <w:body>
-    <w:bookmarkStart w:id="31" w:name="ise-a1-中文草稿-问题与利益相关者证据简报"/>
+    <w:bookmarkStart w:id="32" w:name="ise-a1-中文草稿-问题与利益相关者证据简报"/>
     <w:p>
       <w:pPr>
         <w:pStyle w:val="Heading1"/>
@@ -177,7 +177,7 @@
       </w:r>
     </w:p>
     <w:bookmarkEnd w:id="20"/>
-    <w:bookmarkStart w:id="21" w:name="证据台账"/>
+    <w:bookmarkStart w:id="22" w:name="证据台账"/>
     <w:p>
       <w:pPr>
         <w:pStyle w:val="Heading2"/>
@@ -648,982 +648,13 @@
         </w:tc>
       </w:tr>
     </w:tbl>
-    <w:p>
-      <w:pPr>
-        <w:pStyle w:val="BodyText"/>
-      </w:pPr>
-      <w:r>
-        <w:rPr>
-          <w:bCs/>
-          <w:b/>
-        </w:rPr>
-        <w:t xml:space="preserve">什么会推翻本稿主张</w:t>
-      </w:r>
-      <w:r>
-        <w:t xml:space="preserve">：如果存在</w:t>
-      </w:r>
-      <w:r>
-        <w:rPr>
-          <w:bCs/>
-          <w:b/>
-        </w:rPr>
-        <w:t xml:space="preserve">某一个</w:t>
-      </w:r>
-      <w:r>
-        <w:t xml:space="preserve">来源，同时给全「校区 + 学期 + 开课周 + 星期节次 + 剩余座位」，那”必须联接”这句话就不成立了。</w:t>
-      </w:r>
-      <w:r>
-        <w:t xml:space="preserve"> </w:t>
-      </w:r>
-      <w:r>
-        <w:t xml:space="preserve">截至 2026-09-27 的实测结论是</w:t>
-      </w:r>
-      <w:r>
-        <w:rPr>
-          <w:bCs/>
-          <w:b/>
-        </w:rPr>
-        <w:t xml:space="preserve">不存在</w:t>
-      </w:r>
-      <w:r>
-        <w:t xml:space="preserve">：官方公开库缺学期，官方工作簿缺周次/节次/容量，第三方缺校区/学期。</w:t>
-      </w:r>
-    </w:p>
-    <w:bookmarkEnd w:id="21"/>
-    <w:bookmarkStart w:id="22" w:name="利益相关者与流程"/>
-    <w:p>
-      <w:pPr>
-        <w:pStyle w:val="Heading2"/>
-      </w:pPr>
-      <w:r>
-        <w:t xml:space="preserve">2. 利益相关者与流程</w:t>
-      </w:r>
-    </w:p>
-    <w:p>
-      <w:pPr>
-        <w:numPr>
-          <w:ilvl w:val="0"/>
-          <w:numId w:val="1001"/>
-        </w:numPr>
-        <w:pStyle w:val="Compact"/>
-      </w:pPr>
-      <w:r>
-        <w:rPr>
-          <w:bCs/>
-          <w:b/>
-        </w:rPr>
-        <w:t xml:space="preserve">使用者</w:t>
-      </w:r>
-      <w:r>
-        <w:t xml:space="preserve">：我本人——每学期完整走一遍这套流程的那个人。</w:t>
-      </w:r>
-    </w:p>
-    <w:p>
-      <w:pPr>
-        <w:numPr>
-          <w:ilvl w:val="0"/>
-          <w:numId w:val="1001"/>
-        </w:numPr>
-        <w:pStyle w:val="Compact"/>
-      </w:pPr>
-      <w:r>
-        <w:rPr>
-          <w:bCs/>
-          <w:b/>
-        </w:rPr>
-        <w:t xml:space="preserve">受影响的人</w:t>
-      </w:r>
-      <w:r>
-        <w:t xml:space="preserve">：同校区、同规则的同学；导师（课落在哪，直接影响科研时间怎么排）。</w:t>
-      </w:r>
-    </w:p>
-    <w:p>
-      <w:pPr>
-        <w:numPr>
-          <w:ilvl w:val="0"/>
-          <w:numId w:val="1001"/>
-        </w:numPr>
-        <w:pStyle w:val="Compact"/>
-      </w:pPr>
-      <w:r>
-        <w:rPr>
-          <w:bCs/>
-          <w:b/>
-        </w:rPr>
-        <w:t xml:space="preserve">决策方</w:t>
-      </w:r>
-      <w:r>
-        <w:t xml:space="preserve">：开课院系和教务——它们发布计划、制定规则，</w:t>
-      </w:r>
-      <w:r>
-        <w:rPr>
-          <w:bCs/>
-          <w:b/>
-        </w:rPr>
-        <w:t xml:space="preserve">规则一改，整道题重开</w:t>
-      </w:r>
-      <w:r>
-        <w:t xml:space="preserve">。</w:t>
-      </w:r>
-    </w:p>
-    <w:p>
-      <w:pPr>
-        <w:numPr>
-          <w:ilvl w:val="0"/>
-          <w:numId w:val="1001"/>
-        </w:numPr>
-        <w:pStyle w:val="Compact"/>
-      </w:pPr>
-      <w:r>
-        <w:rPr>
-          <w:bCs/>
-          <w:b/>
-        </w:rPr>
-        <w:t xml:space="preserve">约束</w:t>
-      </w:r>
-      <w:r>
-        <w:t xml:space="preserve">：只能玉泉路（编码第 18 位 =</w:t>
-      </w:r>
-      <w:r>
-        <w:t xml:space="preserve"> </w:t>
-      </w:r>
-      <w:r>
-        <w:rPr>
-          <w:rStyle w:val="VerbatimChar"/>
-        </w:rPr>
-        <w:t xml:space="preserve">Y</w:t>
-      </w:r>
-      <w:r>
-        <w:t xml:space="preserve">）；不跨校区；学位课学分有下限；窗口内先到先得；</w:t>
-      </w:r>
-      <w:r>
-        <w:rPr>
-          <w:bCs/>
-          <w:b/>
-        </w:rPr>
-        <w:t xml:space="preserve">每个来源都只是某个时点的快照</w:t>
-      </w:r>
-      <w:r>
-        <w:t xml:space="preserve">。</w:t>
-      </w:r>
-    </w:p>
-    <w:p>
-      <w:pPr>
-        <w:numPr>
-          <w:ilvl w:val="0"/>
-          <w:numId w:val="1001"/>
-        </w:numPr>
-        <w:pStyle w:val="Compact"/>
-      </w:pPr>
-      <w:r>
-        <w:rPr>
-          <w:bCs/>
-          <w:b/>
-        </w:rPr>
-        <w:t xml:space="preserve">现状</w:t>
-      </w:r>
-      <w:r>
-        <w:t xml:space="preserve">：全靠手工，没有任何工具支持。</w:t>
-      </w:r>
-    </w:p>
-    <w:tbl>
-      <w:tblPr>
-        <w:tblStyle w:val="Table"/>
-        <w:tblW w:type="auto" w:w="0"/>
-        <w:tblLook w:firstRow="1" w:lastRow="0" w:firstColumn="0" w:lastColumn="0" w:noHBand="0" w:noVBand="0" w:val="0020"/>
-        <w:jc w:val="start"/>
-        <w:tblBorders>
-          <w:top w:val="single" w:sz="4" w:color="9AA0AE"/>
-          <w:left w:val="single" w:sz="4" w:color="9AA0AE"/>
-          <w:bottom w:val="single" w:sz="4" w:color="9AA0AE"/>
-          <w:right w:val="single" w:sz="4" w:color="9AA0AE"/>
-          <w:insideH w:val="single" w:sz="4" w:color="9AA0AE"/>
-          <w:insideV w:val="single" w:sz="4" w:color="9AA0AE"/>
-        </w:tblBorders>
-        <w:tblW w:w="5000" w:type="pct"/>
-        <w:tblLayout w:type="autofit"/>
-      </w:tblPr>
-      <w:tblGrid>
-        <w:gridCol w:w="2640"/>
-        <w:gridCol w:w="2640"/>
-        <w:gridCol w:w="2640"/>
-      </w:tblGrid>
-      <w:tr>
-        <w:trPr>
-          <w:tblHeader w:val="true"/>
-        </w:trPr>
-        <w:tc>
-          <w:tcPr>
-            <w:shd w:val="clear" w:fill="F1F2F6"/>
-          </w:tcPr>
-          <w:p>
-            <w:pPr>
-              <w:pStyle w:val="Compact"/>
-              <w:jc w:val="left"/>
-            </w:pPr>
-            <w:r>
-              <w:t xml:space="preserve">步骤</w:t>
-            </w:r>
-          </w:p>
-        </w:tc>
-        <w:tc>
-          <w:tcPr>
-            <w:shd w:val="clear" w:fill="F1F2F6"/>
-          </w:tcPr>
-          <w:p>
-            <w:pPr>
-              <w:pStyle w:val="Compact"/>
-              <w:jc w:val="left"/>
-            </w:pPr>
-            <w:r>
-              <w:t xml:space="preserve">做什么</w:t>
-            </w:r>
-          </w:p>
-        </w:tc>
-        <w:tc>
-          <w:tcPr>
-            <w:shd w:val="clear" w:fill="F1F2F6"/>
-          </w:tcPr>
-          <w:p>
-            <w:pPr>
-              <w:pStyle w:val="Compact"/>
-              <w:jc w:val="left"/>
-            </w:pPr>
-            <w:r>
-              <w:t xml:space="preserve">依赖 / 备注</w:t>
-            </w:r>
-          </w:p>
-        </w:tc>
-      </w:tr>
-      <w:tr>
-        <w:tc>
-          <w:tcPr/>
-          <w:p>
-            <w:pPr>
-              <w:pStyle w:val="Compact"/>
-              <w:jc w:val="left"/>
-            </w:pPr>
-            <w:r>
-              <w:t xml:space="preserve">1</w:t>
-            </w:r>
-          </w:p>
-        </w:tc>
-        <w:tc>
-          <w:tcPr/>
-          <w:p>
-            <w:pPr>
-              <w:pStyle w:val="Compact"/>
-              <w:jc w:val="left"/>
-            </w:pPr>
-            <w:r>
-              <w:t xml:space="preserve">读培养方案要求</w:t>
-            </w:r>
-          </w:p>
-        </w:tc>
-        <w:tc>
-          <w:tcPr/>
-          <w:p>
-            <w:pPr>
-              <w:pStyle w:val="Compact"/>
-              <w:jc w:val="left"/>
-            </w:pPr>
-            <w:r>
-              <w:t xml:space="preserve">任何数据源里都没有——只能人工输入</w:t>
-            </w:r>
-          </w:p>
-        </w:tc>
-      </w:tr>
-      <w:tr>
-        <w:tc>
-          <w:tcPr/>
-          <w:p>
-            <w:pPr>
-              <w:pStyle w:val="Compact"/>
-              <w:jc w:val="left"/>
-            </w:pPr>
-            <w:r>
-              <w:t xml:space="preserve">2</w:t>
-            </w:r>
-          </w:p>
-        </w:tc>
-        <w:tc>
-          <w:tcPr/>
-          <w:p>
-            <w:pPr>
-              <w:pStyle w:val="Compact"/>
-              <w:jc w:val="left"/>
-            </w:pPr>
-            <w:r>
-              <w:t xml:space="preserve">凑出候选课 + 它们的时间</w:t>
-            </w:r>
-          </w:p>
-        </w:tc>
-        <w:tc>
-          <w:tcPr/>
-          <w:p>
-            <w:pPr>
-              <w:pStyle w:val="Compact"/>
-              <w:jc w:val="left"/>
-            </w:pPr>
-            <w:r>
-              <w:t xml:space="preserve">三个来源，手工对接（E3、E4、E5）</w:t>
-            </w:r>
-          </w:p>
-        </w:tc>
-      </w:tr>
-      <w:tr>
-        <w:tc>
-          <w:tcPr/>
-          <w:p>
-            <w:pPr>
-              <w:pStyle w:val="Compact"/>
-              <w:jc w:val="left"/>
-            </w:pPr>
-            <w:r>
-              <w:t xml:space="preserve">3</w:t>
-            </w:r>
-          </w:p>
-        </w:tc>
-        <w:tc>
-          <w:tcPr/>
-          <w:p>
-            <w:pPr>
-              <w:pStyle w:val="Compact"/>
-              <w:jc w:val="left"/>
-            </w:pPr>
-            <w:r>
-              <w:t xml:space="preserve">逐门收集容量 / 已选</w:t>
-            </w:r>
-          </w:p>
-        </w:tc>
-        <w:tc>
-          <w:tcPr/>
-          <w:p>
-            <w:pPr>
-              <w:pStyle w:val="Compact"/>
-              <w:jc w:val="left"/>
-            </w:pPr>
-            <w:r>
-              <w:t xml:space="preserve">只有官方公开库和第三方有（E4、E5）</w:t>
-            </w:r>
-          </w:p>
-        </w:tc>
-      </w:tr>
-      <w:tr>
-        <w:tc>
-          <w:tcPr/>
-          <w:p>
-            <w:pPr>
-              <w:pStyle w:val="Compact"/>
-              <w:jc w:val="left"/>
-            </w:pPr>
-            <w:r>
-              <w:t xml:space="preserve">4</w:t>
-            </w:r>
-          </w:p>
-        </w:tc>
-        <w:tc>
-          <w:tcPr/>
-          <w:p>
-            <w:pPr>
-              <w:pStyle w:val="Compact"/>
-              <w:jc w:val="left"/>
-            </w:pPr>
-            <w:r>
-              <w:rPr>
-                <w:bCs/>
-                <w:b/>
-              </w:rPr>
-              <w:t xml:space="preserve">查冲突</w:t>
-            </w:r>
-          </w:p>
-        </w:tc>
-        <w:tc>
-          <w:tcPr/>
-          <w:p>
-            <w:pPr>
-              <w:pStyle w:val="Compact"/>
-              <w:jc w:val="left"/>
-            </w:pPr>
-            <w:r>
-              <w:rPr>
-                <w:bCs/>
-                <w:b/>
-              </w:rPr>
-              <w:t xml:space="preserve">★断点：三个维度同时判</w:t>
-            </w:r>
-            <w:r>
-              <w:t xml:space="preserve">（E1、E3、E4）</w:t>
-            </w:r>
-          </w:p>
-        </w:tc>
-      </w:tr>
-      <w:tr>
-        <w:tc>
-          <w:tcPr/>
-          <w:p>
-            <w:pPr>
-              <w:pStyle w:val="Compact"/>
-              <w:jc w:val="left"/>
-            </w:pPr>
-            <w:r>
-              <w:t xml:space="preserve">5</w:t>
-            </w:r>
-          </w:p>
-        </w:tc>
-        <w:tc>
-          <w:tcPr/>
-          <w:p>
-            <w:pPr>
-              <w:pStyle w:val="Compact"/>
-              <w:jc w:val="left"/>
-            </w:pPr>
-            <w:r>
-              <w:t xml:space="preserve">决定按什么顺序去抢</w:t>
-            </w:r>
-          </w:p>
-        </w:tc>
-        <w:tc>
-          <w:tcPr/>
-          <w:p>
-            <w:pPr>
-              <w:pStyle w:val="Compact"/>
-              <w:jc w:val="left"/>
-            </w:pPr>
-            <w:r>
-              <w:t xml:space="preserve">另一个完全不同的排序问题（E5 + 优先级规则）</w:t>
-            </w:r>
-          </w:p>
-        </w:tc>
-      </w:tr>
-      <w:tr>
-        <w:tc>
-          <w:tcPr/>
-          <w:p>
-            <w:pPr>
-              <w:pStyle w:val="Compact"/>
-              <w:jc w:val="left"/>
-            </w:pPr>
-            <w:r>
-              <w:t xml:space="preserve">6</w:t>
-            </w:r>
-          </w:p>
-        </w:tc>
-        <w:tc>
-          <w:tcPr/>
-          <w:p>
-            <w:pPr>
-              <w:pStyle w:val="Compact"/>
-              <w:jc w:val="left"/>
-            </w:pPr>
-            <w:r>
-              <w:t xml:space="preserve">在选课窗口里提交</w:t>
-            </w:r>
-          </w:p>
-        </w:tc>
-        <w:tc>
-          <w:tcPr/>
-          <w:p>
-            <w:pPr>
-              <w:pStyle w:val="Compact"/>
-              <w:jc w:val="left"/>
-            </w:pPr>
-            <w:r>
-              <w:t xml:space="preserve">先到先得；失败就得重排（E2）</w:t>
-            </w:r>
-          </w:p>
-        </w:tc>
-      </w:tr>
-      <w:tr>
-        <w:tc>
-          <w:tcPr/>
-          <w:p>
-            <w:pPr>
-              <w:pStyle w:val="Compact"/>
-              <w:jc w:val="left"/>
-            </w:pPr>
-            <w:r>
-              <w:t xml:space="preserve">7</w:t>
-            </w:r>
-          </w:p>
-        </w:tc>
-        <w:tc>
-          <w:tcPr/>
-          <w:p>
-            <w:pPr>
-              <w:pStyle w:val="Compact"/>
-              <w:jc w:val="left"/>
-            </w:pPr>
-            <w:r>
-              <w:t xml:space="preserve">没抢到的重新排</w:t>
-            </w:r>
-          </w:p>
-        </w:tc>
-        <w:tc>
-          <w:tcPr/>
-          <w:p>
-            <w:pPr>
-              <w:pStyle w:val="Compact"/>
-              <w:jc w:val="left"/>
-            </w:pPr>
-            <w:r>
-              <w:t xml:space="preserve">回到第 4 步，整张表重查（E1）</w:t>
-            </w:r>
-          </w:p>
-        </w:tc>
-      </w:tr>
-    </w:tbl>
-    <w:p>
-      <w:pPr>
-        <w:pStyle w:val="BodyText"/>
-      </w:pPr>
-      <w:r>
-        <w:rPr>
-          <w:bCs/>
-          <w:b/>
-        </w:rPr>
-        <w:t xml:space="preserve">最大的断点在第 2–5 步。</w:t>
-      </w:r>
-      <w:r>
-        <w:t xml:space="preserve">一次冲突要同时满足</w:t>
-      </w:r>
-      <w:r>
-        <w:rPr>
-          <w:bCs/>
-          <w:b/>
-        </w:rPr>
-        <w:t xml:space="preserve">同一星期 + 节次重叠 + 周次区间重叠</w:t>
-      </w:r>
-      <w:r>
-        <w:t xml:space="preserve">这三个条件；两份官方工作簿既没有周次也没有星期节次，而唯一同时有这两个字段的来源没有校区，所以拼输入的过程就是拼几个</w:t>
-      </w:r>
-      <w:r>
-        <w:rPr>
-          <w:bCs/>
-          <w:b/>
-        </w:rPr>
-        <w:t xml:space="preserve">只部分重叠</w:t>
-      </w:r>
-      <w:r>
-        <w:t xml:space="preserve">的来源。</w:t>
-      </w:r>
-    </w:p>
-    <w:bookmarkEnd w:id="22"/>
-    <w:bookmarkStart w:id="23" w:name="问题与价值陈述"/>
-    <w:p>
-      <w:pPr>
-        <w:pStyle w:val="Heading2"/>
-      </w:pPr>
-      <w:r>
-        <w:t xml:space="preserve">3. 问题与价值陈述</w:t>
-      </w:r>
-    </w:p>
-    <w:p>
-      <w:pPr>
-        <w:pStyle w:val="FirstParagraph"/>
-      </w:pPr>
-      <w:r>
-        <w:rPr>
-          <w:bCs/>
-          <w:b/>
-        </w:rPr>
-        <w:t xml:space="preserve">谁、在哪、多频繁。</w:t>
-      </w:r>
-      <w:r>
-        <w:t xml:space="preserve">每个选课季，我要在一个</w:t>
-      </w:r>
-      <w:r>
-        <w:rPr>
-          <w:bCs/>
-          <w:b/>
-        </w:rPr>
-        <w:t xml:space="preserve">受校区限制的课池</w:t>
-      </w:r>
-      <w:r>
-        <w:t xml:space="preserve">里，凑出十来门课组成一个学期，同时满足培养方案的学分要求。课池有多大：官方工作簿记了玉泉路 414 门，公开库 341 门，</w:t>
-      </w:r>
-      <w:r>
-        <w:rPr>
-          <w:bCs/>
-          <w:b/>
-        </w:rPr>
-        <w:t xml:space="preserve">两边都有的只有 212 门</w:t>
-      </w:r>
-      <w:r>
-        <w:t xml:space="preserve">。从发布到封网只有几天，方案要在这几天里反复改。</w:t>
-      </w:r>
-    </w:p>
-    <w:p>
-      <w:pPr>
-        <w:pStyle w:val="BodyText"/>
-      </w:pPr>
-      <w:r>
-        <w:rPr>
-          <w:bCs/>
-          <w:b/>
-        </w:rPr>
-        <w:t xml:space="preserve">痛点一：字段被拆在不同来源里。</w:t>
-      </w:r>
-    </w:p>
-    <w:p>
-      <w:pPr>
-        <w:numPr>
-          <w:ilvl w:val="0"/>
-          <w:numId w:val="1002"/>
-        </w:numPr>
-        <w:pStyle w:val="Compact"/>
-      </w:pPr>
-      <w:r>
-        <w:t xml:space="preserve">官方工作簿（4,877 条）有校区、学期、属性、学分，但玉泉路那 732 条里</w:t>
-      </w:r>
-      <w:r>
-        <w:rPr>
-          <w:bCs/>
-          <w:b/>
-        </w:rPr>
-        <w:t xml:space="preserve">开课周 0 条、星期节次 0 条</w:t>
-      </w:r>
-      <w:r>
-        <w:t xml:space="preserve">——导入器自己报了 4 次。</w:t>
-      </w:r>
-    </w:p>
-    <w:p>
-      <w:pPr>
-        <w:numPr>
-          <w:ilvl w:val="0"/>
-          <w:numId w:val="1002"/>
-        </w:numPr>
-        <w:pStyle w:val="Compact"/>
-      </w:pPr>
-      <w:r>
-        <w:t xml:space="preserve">官方公开库有校区、限选/已选，详情页还有星期/节次/周次——</w:t>
-      </w:r>
-      <w:r>
-        <w:rPr>
-          <w:bCs/>
-          <w:b/>
-        </w:rPr>
-        <w:t xml:space="preserve">可它不按课程给学期</w:t>
-      </w:r>
-      <w:r>
-        <w:t xml:space="preserve">。</w:t>
-      </w:r>
-    </w:p>
-    <w:p>
-      <w:pPr>
-        <w:numPr>
-          <w:ilvl w:val="0"/>
-          <w:numId w:val="1002"/>
-        </w:numPr>
-        <w:pStyle w:val="Compact"/>
-      </w:pPr>
-      <w:r>
-        <w:t xml:space="preserve">第三方库有星期/节次/周次/容量，但</w:t>
-      </w:r>
-      <w:r>
-        <w:rPr>
-          <w:bCs/>
-          <w:b/>
-        </w:rPr>
-        <w:t xml:space="preserve">没有校区字段</w:t>
-      </w:r>
-      <w:r>
-        <w:t xml:space="preserve">，玉泉路子集只能靠”编码第 18 位 = Y”这条规则去认，而且它也不记学期。</w:t>
-      </w:r>
-    </w:p>
-    <w:p>
-      <w:pPr>
-        <w:numPr>
-          <w:ilvl w:val="0"/>
-          <w:numId w:val="1002"/>
-        </w:numPr>
-        <w:pStyle w:val="Compact"/>
-      </w:pPr>
-      <w:r>
-        <w:t xml:space="preserve">两边一接：</w:t>
-      </w:r>
-      <w:r>
-        <w:rPr>
-          <w:bCs/>
-          <w:b/>
-        </w:rPr>
-        <w:t xml:space="preserve">129 门查不到学期、202 门查不到时间和容量</w:t>
-      </w:r>
-      <w:r>
-        <w:t xml:space="preserve">。</w:t>
-      </w:r>
-    </w:p>
-    <w:p>
-      <w:pPr>
-        <w:pStyle w:val="FirstParagraph"/>
-      </w:pPr>
-      <w:r>
-        <w:rPr>
-          <w:bCs/>
-          <w:b/>
-        </w:rPr>
-        <w:t xml:space="preserve">痛点二：检查本身是三维的。</w:t>
-      </w:r>
-      <w:r>
-        <w:t xml:space="preserve">一次冲突要</w:t>
-      </w:r>
-      <w:r>
-        <w:rPr>
-          <w:bCs/>
-          <w:b/>
-        </w:rPr>
-        <w:t xml:space="preserve">同一星期、节次重叠、周次区间重叠</w:t>
-      </w:r>
-      <w:r>
-        <w:t xml:space="preserve">三者同时成立。实测方案里的周次占用从 5 周到 19 周不等；2026-09-05 那版方案里有个格子（</w:t>
-      </w:r>
-      <w:r>
-        <w:rPr>
-          <w:rStyle w:val="VerbatimChar"/>
-        </w:rPr>
-        <w:t xml:space="preserve">C5</w:t>
-      </w:r>
-      <w:r>
-        <w:t xml:space="preserve">，周二第 1–4 节）在第 11–18 周是《新时代中国特色社会主义理论与实践》，在第 2–5 周和第 7–10 周是《自然辩证法概论》。</w:t>
-      </w:r>
-      <w:r>
-        <w:rPr>
-          <w:bCs/>
-          <w:b/>
-        </w:rPr>
-        <w:t xml:space="preserve">只按”星期 + 节次”判，会误报成冲突；只有把周次算进来才知道不是冲突。</w:t>
-      </w:r>
-    </w:p>
-    <w:p>
-      <w:pPr>
-        <w:pStyle w:val="BodyText"/>
-      </w:pPr>
-      <w:r>
-        <w:rPr>
-          <w:bCs/>
-          <w:b/>
-        </w:rPr>
-        <w:t xml:space="preserve">现在的土办法和代价。</w:t>
-      </w:r>
-      <w:r>
-        <w:t xml:space="preserve">把整学期的周表一张张用眼睛读，只要任何一门课动一下，就得把整张表重新查一遍。两版方案之间：</w:t>
-      </w:r>
-      <w:r>
-        <w:rPr>
-          <w:bCs/>
-          <w:b/>
-        </w:rPr>
-        <w:t xml:space="preserve">22 个格子被删、45 个新增、0 个原地修改</w:t>
-      </w:r>
-      <w:r>
-        <w:t xml:space="preserve">——方案是重排出来的，每重排一次就强制重查一次。</w:t>
-      </w:r>
-    </w:p>
-    <w:p>
-      <w:pPr>
-        <w:pStyle w:val="BodyText"/>
-      </w:pPr>
-      <w:r>
-        <w:rPr>
-          <w:bCs/>
-          <w:b/>
-        </w:rPr>
-        <w:t xml:space="preserve">干预方案与价值度量。</w:t>
-      </w:r>
-      <w:r>
-        <w:t xml:space="preserve">把来源按课程编码接成</w:t>
-      </w:r>
-      <w:r>
-        <w:rPr>
-          <w:bCs/>
-          <w:b/>
-        </w:rPr>
-        <w:t xml:space="preserve">一份冻结输入</w:t>
-      </w:r>
-      <w:r>
-        <w:t xml:space="preserve">；做三维冲突检测；输出</w:t>
-      </w:r>
-      <w:r>
-        <w:rPr>
-          <w:bCs/>
-          <w:b/>
-        </w:rPr>
-        <w:t xml:space="preserve">两张不同的清单</w:t>
-      </w:r>
-      <w:r>
-        <w:t xml:space="preserve">——一份无冲突排课方案，一份按”不可延性 × 座位紧张度”排的抢课顺序。价值用同一套输入、同一套流程来量：现在手工走一遍要</w:t>
-      </w:r>
-      <w:r>
-        <w:t xml:space="preserve"> </w:t>
-      </w:r>
-      <w:r>
-        <w:rPr>
-          <w:bCs/>
-          <w:b/>
-        </w:rPr>
-        <w:t xml:space="preserve">[待填：__ 分钟，掐表，__ 门课]</w:t>
-      </w:r>
-      <w:r>
-        <w:t xml:space="preserve">，目标是压到 5 分钟以内。</w:t>
-      </w:r>
-    </w:p>
-    <w:p>
-      <w:pPr>
-        <w:pStyle w:val="BodyText"/>
-      </w:pPr>
-      <w:r>
-        <w:rPr>
-          <w:bCs/>
-          <w:b/>
-        </w:rPr>
-        <w:t xml:space="preserve">还不确定的地方。</w:t>
-      </w:r>
-    </w:p>
-    <w:p>
-      <w:pPr>
-        <w:numPr>
-          <w:ilvl w:val="0"/>
-          <w:numId w:val="1003"/>
-        </w:numPr>
-        <w:pStyle w:val="Compact"/>
-      </w:pPr>
-      <w:r>
-        <w:t xml:space="preserve">那些查不到学期的课，到底能不能从某个来源补出来，还是必须每学期人工录一次——</w:t>
-      </w:r>
-      <w:r>
-        <w:rPr>
-          <w:bCs/>
-          <w:b/>
-        </w:rPr>
-        <w:t xml:space="preserve">这一条会决定整个设计</w:t>
-      </w:r>
-      <w:r>
-        <w:t xml:space="preserve">。</w:t>
-      </w:r>
-    </w:p>
-    <w:p>
-      <w:pPr>
-        <w:numPr>
-          <w:ilvl w:val="0"/>
-          <w:numId w:val="1003"/>
-        </w:numPr>
-        <w:pStyle w:val="Compact"/>
-      </w:pPr>
-      <w:r>
-        <w:t xml:space="preserve">这个痛点除我之外有多普遍（E1 目前只是我一个人的记录 + 一位同学的说法）。</w:t>
-      </w:r>
-    </w:p>
-    <w:p>
-      <w:pPr>
-        <w:numPr>
-          <w:ilvl w:val="0"/>
-          <w:numId w:val="1003"/>
-        </w:numPr>
-        <w:pStyle w:val="Compact"/>
-      </w:pPr>
-      <w:r>
-        <w:t xml:space="preserve">官方数据里”限选人数”为</w:t>
-      </w:r>
-      <w:r>
-        <w:rPr>
-          <w:bCs/>
-          <w:b/>
-        </w:rPr>
-        <w:t xml:space="preserve">空</w:t>
-      </w:r>
-      <w:r>
-        <w:t xml:space="preserve">和显示为</w:t>
-      </w:r>
-      <w:r>
-        <w:t xml:space="preserve"> </w:t>
-      </w:r>
-      <w:r>
-        <w:rPr>
-          <w:rStyle w:val="VerbatimChar"/>
-          <w:bCs/>
-          <w:b/>
-        </w:rPr>
-        <w:t xml:space="preserve">/</w:t>
-      </w:r>
-      <w:r>
-        <w:t xml:space="preserve"> </w:t>
-      </w:r>
-      <w:r>
-        <w:t xml:space="preserve">是两回事：</w:t>
-      </w:r>
-      <w:r>
-        <w:rPr>
-          <w:bCs/>
-          <w:b/>
-        </w:rPr>
-        <w:t xml:space="preserve">实测</w:t>
-      </w:r>
-      <w:r>
-        <w:rPr>
-          <w:bCs/>
-          <w:b/>
-        </w:rPr>
-        <w:t xml:space="preserve"> </w:t>
-      </w:r>
-      <w:r>
-        <w:rPr>
-          <w:rStyle w:val="VerbatimChar"/>
-          <w:bCs/>
-          <w:b/>
-        </w:rPr>
-        <w:t xml:space="preserve">/</w:t>
-      </w:r>
-      <w:r>
-        <w:rPr>
-          <w:bCs/>
-          <w:b/>
-        </w:rPr>
-        <w:t xml:space="preserve">（斜杠）表示”不设限选人数”</w:t>
-      </w:r>
-      <w:r>
-        <w:t xml:space="preserve">，不是缺数据；真正为空的才算”未知”。</w:t>
-      </w:r>
-      <w:r>
-        <w:rPr>
-          <w:bCs/>
-          <w:b/>
-        </w:rPr>
-        <w:t xml:space="preserve">未知一律当”未知”，绝不当”不限”。</w:t>
-      </w:r>
-    </w:p>
-    <w:p>
-      <w:pPr>
-        <w:pStyle w:val="FirstParagraph"/>
-      </w:pPr>
-      <w:r>
-        <w:rPr>
-          <w:bCs/>
-          <w:b/>
-        </w:rPr>
-        <w:t xml:space="preserve">为什么这是”一学期规模的活”而不是”一小时脚本”。</w:t>
-      </w:r>
-      <w:r>
-        <w:t xml:space="preserve">四件事撑着：把三个只部分重叠的来源接起来、而且要可复现地接；把三维冲突规则做对、可测；把</w:t>
-      </w:r>
-      <w:r>
-        <w:rPr>
-          <w:bCs/>
-          <w:b/>
-        </w:rPr>
-        <w:t xml:space="preserve">两个序</w:t>
-      </w:r>
-      <w:r>
-        <w:t xml:space="preserve">分开（排课方案 vs 抢课顺序），别用一个问题的答案去回答另一个；以及让”拒绝理由”写得足够清楚，让人敢信它的输出。</w:t>
-      </w:r>
-    </w:p>
-    <w:bookmarkEnd w:id="23"/>
-    <w:bookmarkStart w:id="24" w:name="量化"/>
-    <w:p>
-      <w:pPr>
-        <w:pStyle w:val="Heading2"/>
-      </w:pPr>
-      <w:r>
-        <w:t xml:space="preserve">4. 量化</w:t>
+    <w:bookmarkStart w:id="21" w:name="每条证据我是怎么独立核对的independent-verification"/>
+    <w:p>
+      <w:pPr>
+        <w:pStyle w:val="Heading3"/>
+      </w:pPr>
+      <w:r>
+        <w:t xml:space="preserve">1.1 每条证据我是怎么独立核对的（independent verification）</w:t>
       </w:r>
     </w:p>
     <w:tbl>
@@ -1664,7 +695,7 @@
               <w:jc w:val="left"/>
             </w:pPr>
             <w:r>
-              <w:t xml:space="preserve">度量的东西</w:t>
+              <w:t xml:space="preserve">编号</w:t>
             </w:r>
           </w:p>
         </w:tc>
@@ -1678,7 +709,7 @@
               <w:jc w:val="left"/>
             </w:pPr>
             <w:r>
-              <w:t xml:space="preserve">数值</w:t>
+              <w:t xml:space="preserve">我做的核对动作（可复核）</w:t>
             </w:r>
           </w:p>
         </w:tc>
@@ -1692,7 +723,7 @@
               <w:jc w:val="left"/>
             </w:pPr>
             <w:r>
-              <w:t xml:space="preserve">怎么测的</w:t>
+              <w:t xml:space="preserve">结果</w:t>
             </w:r>
           </w:p>
         </w:tc>
@@ -1706,7 +737,7 @@
               <w:jc w:val="left"/>
             </w:pPr>
             <w:r>
-              <w:t xml:space="preserve">日期</w:t>
+              <w:t xml:space="preserve">对原结论的影响</w:t>
             </w:r>
           </w:p>
         </w:tc>
@@ -1720,47 +751,68 @@
               <w:jc w:val="left"/>
             </w:pPr>
             <w:r>
-              <w:t xml:space="preserve">基线：手工完整查一遍冲突</w:t>
-            </w:r>
-          </w:p>
-        </w:tc>
-        <w:tc>
-          <w:tcPr/>
-          <w:p>
-            <w:pPr>
-              <w:pStyle w:val="Compact"/>
-              <w:jc w:val="left"/>
-            </w:pPr>
+              <w:t xml:space="preserve">E3</w:t>
+            </w:r>
+          </w:p>
+        </w:tc>
+        <w:tc>
+          <w:tcPr/>
+          <w:p>
+            <w:pPr>
+              <w:pStyle w:val="Compact"/>
+              <w:jc w:val="left"/>
+            </w:pPr>
+            <w:r>
+              <w:t xml:space="preserve">用导入器自报的 4 条</w:t>
+            </w:r>
+            <w:r>
+              <w:t xml:space="preserve"> </w:t>
+            </w:r>
+            <w:r>
+              <w:rPr>
+                <w:rStyle w:val="VerbatimChar"/>
+              </w:rPr>
+              <w:t xml:space="preserve">importIssues</w:t>
+            </w:r>
+            <w:r>
+              <w:t xml:space="preserve"> </w:t>
+            </w:r>
+            <w:r>
+              <w:t xml:space="preserve">反查官方工作簿的列名，确认”开课周/星期节次”是</w:t>
+            </w:r>
             <w:r>
               <w:rPr>
                 <w:bCs/>
                 <w:b/>
               </w:rPr>
-              <w:t xml:space="preserve">[待填：__ 分钟]</w:t>
-            </w:r>
-          </w:p>
-        </w:tc>
-        <w:tc>
-          <w:tcPr/>
-          <w:p>
-            <w:pPr>
-              <w:pStyle w:val="Compact"/>
-              <w:jc w:val="left"/>
-            </w:pPr>
-            <w:r>
-              <w:t xml:space="preserve">对 2026-09-15 那版方案的 [待填：__ 门课] 掐表，跑 3 次</w:t>
-            </w:r>
-          </w:p>
-        </w:tc>
-        <w:tc>
-          <w:tcPr/>
-          <w:p>
-            <w:pPr>
-              <w:pStyle w:val="Compact"/>
-              <w:jc w:val="left"/>
-            </w:pPr>
-            <w:r>
-              <w:t xml:space="preserve">[待填]</w:t>
+              <w:t xml:space="preserve">列本身不存在</w:t>
+            </w:r>
+            <w:r>
+              <w:t xml:space="preserve">，而不是导入时被丢掉</w:t>
+            </w:r>
+          </w:p>
+        </w:tc>
+        <w:tc>
+          <w:tcPr/>
+          <w:p>
+            <w:pPr>
+              <w:pStyle w:val="Compact"/>
+              <w:jc w:val="left"/>
+            </w:pPr>
+            <w:r>
+              <w:t xml:space="preserve">列确实不存在</w:t>
+            </w:r>
+          </w:p>
+        </w:tc>
+        <w:tc>
+          <w:tcPr/>
+          <w:p>
+            <w:pPr>
+              <w:pStyle w:val="Compact"/>
+              <w:jc w:val="left"/>
+            </w:pPr>
+            <w:r>
+              <w:t xml:space="preserve">接受</w:t>
             </w:r>
           </w:p>
         </w:tc>
@@ -1774,43 +826,65 @@
               <w:jc w:val="left"/>
             </w:pPr>
             <w:r>
-              <w:t xml:space="preserve">每学期完整重查次数</w:t>
-            </w:r>
-          </w:p>
-        </w:tc>
-        <w:tc>
-          <w:tcPr/>
-          <w:p>
-            <w:pPr>
-              <w:pStyle w:val="Compact"/>
-              <w:jc w:val="left"/>
-            </w:pPr>
-            <w:r>
-              <w:t xml:space="preserve">≥ 2</w:t>
-            </w:r>
-          </w:p>
-        </w:tc>
-        <w:tc>
-          <w:tcPr/>
-          <w:p>
-            <w:pPr>
-              <w:pStyle w:val="Compact"/>
-              <w:jc w:val="left"/>
-            </w:pPr>
-            <w:r>
-              <w:t xml:space="preserve">两版方案之间存在一次整体重排（E1）</w:t>
-            </w:r>
-          </w:p>
-        </w:tc>
-        <w:tc>
-          <w:tcPr/>
-          <w:p>
-            <w:pPr>
-              <w:pStyle w:val="Compact"/>
-              <w:jc w:val="left"/>
-            </w:pPr>
-            <w:r>
-              <w:t xml:space="preserve">2026-09-25</w:t>
+              <w:t xml:space="preserve">E4</w:t>
+            </w:r>
+          </w:p>
+        </w:tc>
+        <w:tc>
+          <w:tcPr/>
+          <w:p>
+            <w:pPr>
+              <w:pStyle w:val="Compact"/>
+              <w:jc w:val="left"/>
+            </w:pPr>
+            <w:r>
+              <w:t xml:space="preserve">逐门课 GET</w:t>
+            </w:r>
+            <w:r>
+              <w:t xml:space="preserve"> </w:t>
+            </w:r>
+            <w:r>
+              <w:rPr>
+                <w:rStyle w:val="VerbatimChar"/>
+              </w:rPr>
+              <w:t xml:space="preserve">coursetime/&lt;id&gt;</w:t>
+            </w:r>
+            <w:r>
+              <w:t xml:space="preserve"> </w:t>
+            </w:r>
+            <w:r>
+              <w:t xml:space="preserve">详情页，与列表页的 校区/限选/已选 对照；再抽样与第三方快照比对星期/节次/周次</w:t>
+            </w:r>
+          </w:p>
+        </w:tc>
+        <w:tc>
+          <w:tcPr/>
+          <w:p>
+            <w:pPr>
+              <w:pStyle w:val="Compact"/>
+              <w:jc w:val="left"/>
+            </w:pPr>
+            <w:r>
+              <w:t xml:space="preserve">两源在星期/节次/周次上</w:t>
+            </w:r>
+            <w:r>
+              <w:rPr>
+                <w:bCs/>
+                <w:b/>
+              </w:rPr>
+              <w:t xml:space="preserve">完全一致</w:t>
+            </w:r>
+          </w:p>
+        </w:tc>
+        <w:tc>
+          <w:tcPr/>
+          <w:p>
+            <w:pPr>
+              <w:pStyle w:val="Compact"/>
+              <w:jc w:val="left"/>
+            </w:pPr>
+            <w:r>
+              <w:t xml:space="preserve">接受</w:t>
             </w:r>
           </w:p>
         </w:tc>
@@ -1824,43 +898,57 @@
               <w:jc w:val="left"/>
             </w:pPr>
             <w:r>
-              <w:t xml:space="preserve">方案中达到容量 90% 以上的课</w:t>
-            </w:r>
-          </w:p>
-        </w:tc>
-        <w:tc>
-          <w:tcPr/>
-          <w:p>
-            <w:pPr>
-              <w:pStyle w:val="Compact"/>
-              <w:jc w:val="left"/>
-            </w:pPr>
-            <w:r>
-              <w:t xml:space="preserve">13 门里 8 门</w:t>
-            </w:r>
-          </w:p>
-        </w:tc>
-        <w:tc>
-          <w:tcPr/>
-          <w:p>
-            <w:pPr>
-              <w:pStyle w:val="Compact"/>
-              <w:jc w:val="left"/>
-            </w:pPr>
-            <w:r>
-              <w:t xml:space="preserve">用冻结的容量快照</w:t>
-            </w:r>
-          </w:p>
-        </w:tc>
-        <w:tc>
-          <w:tcPr/>
-          <w:p>
-            <w:pPr>
-              <w:pStyle w:val="Compact"/>
-              <w:jc w:val="left"/>
-            </w:pPr>
-            <w:r>
-              <w:t xml:space="preserve">2026-09-27</w:t>
+              <w:t xml:space="preserve">E5</w:t>
+            </w:r>
+          </w:p>
+        </w:tc>
+        <w:tc>
+          <w:tcPr/>
+          <w:p>
+            <w:pPr>
+              <w:pStyle w:val="Compact"/>
+              <w:jc w:val="left"/>
+            </w:pPr>
+            <w:r>
+              <w:t xml:space="preserve">反查官方三处（列表页 / coursetime / courseplan）＋工作簿字段，检索”考试方式/授课方式/是否远程教学”</w:t>
+            </w:r>
+          </w:p>
+        </w:tc>
+        <w:tc>
+          <w:tcPr/>
+          <w:p>
+            <w:pPr>
+              <w:pStyle w:val="Compact"/>
+              <w:jc w:val="left"/>
+            </w:pPr>
+            <w:r>
+              <w:rPr>
+                <w:bCs/>
+                <w:b/>
+              </w:rPr>
+              <w:t xml:space="preserve">官方 0 命中</w:t>
+            </w:r>
+            <w:r>
+              <w:t xml:space="preserve">；而第三方字段名恰为 SEP 学期课表的 19 列表头</w:t>
+            </w:r>
+          </w:p>
+        </w:tc>
+        <w:tc>
+          <w:tcPr/>
+          <w:p>
+            <w:pPr>
+              <w:pStyle w:val="Compact"/>
+              <w:jc w:val="left"/>
+            </w:pPr>
+            <w:r>
+              <w:rPr>
+                <w:bCs/>
+                <w:b/>
+              </w:rPr>
+              <w:t xml:space="preserve">推翻</w:t>
+            </w:r>
+            <w:r>
+              <w:t xml:space="preserve">了我先前”第三方也许只是抄了某个公开页”的推测</w:t>
             </w:r>
           </w:p>
         </w:tc>
@@ -1874,43 +962,66 @@
               <w:jc w:val="left"/>
             </w:pPr>
             <w:r>
-              <w:t xml:space="preserve">方案中”任何来源都查不到学期”的课</w:t>
-            </w:r>
-          </w:p>
-        </w:tc>
-        <w:tc>
-          <w:tcPr/>
-          <w:p>
-            <w:pPr>
-              <w:pStyle w:val="Compact"/>
-              <w:jc w:val="left"/>
-            </w:pPr>
-            <w:r>
-              <w:t xml:space="preserve">14 门里 6 门</w:t>
-            </w:r>
-          </w:p>
-        </w:tc>
-        <w:tc>
-          <w:tcPr/>
-          <w:p>
-            <w:pPr>
-              <w:pStyle w:val="Compact"/>
-              <w:jc w:val="left"/>
-            </w:pPr>
-            <w:r>
-              <w:t xml:space="preserve">对冻结的官方导入做联接</w:t>
-            </w:r>
-          </w:p>
-        </w:tc>
-        <w:tc>
-          <w:tcPr/>
-          <w:p>
-            <w:pPr>
-              <w:pStyle w:val="Compact"/>
-              <w:jc w:val="left"/>
-            </w:pPr>
-            <w:r>
-              <w:t xml:space="preserve">2026-09-27</w:t>
+              <w:t xml:space="preserve">E6</w:t>
+            </w:r>
+          </w:p>
+        </w:tc>
+        <w:tc>
+          <w:tcPr/>
+          <w:p>
+            <w:pPr>
+              <w:pStyle w:val="Compact"/>
+              <w:jc w:val="left"/>
+            </w:pPr>
+            <w:r>
+              <w:t xml:space="preserve">按课程编码联接两份</w:t>
+            </w:r>
+            <w:r>
+              <w:rPr>
+                <w:bCs/>
+                <w:b/>
+              </w:rPr>
+              <w:t xml:space="preserve">官方</w:t>
+            </w:r>
+            <w:r>
+              <w:t xml:space="preserve">冻结件并重跑，核对交集</w:t>
+            </w:r>
+          </w:p>
+        </w:tc>
+        <w:tc>
+          <w:tcPr/>
+          <w:p>
+            <w:pPr>
+              <w:pStyle w:val="Compact"/>
+              <w:jc w:val="left"/>
+            </w:pPr>
+            <w:r>
+              <w:t xml:space="preserve">341 门中仅</w:t>
+            </w:r>
+            <w:r>
+              <w:t xml:space="preserve"> </w:t>
+            </w:r>
+            <w:r>
+              <w:rPr>
+                <w:bCs/>
+                <w:b/>
+              </w:rPr>
+              <w:t xml:space="preserve">212 门</w:t>
+            </w:r>
+            <w:r>
+              <w:t xml:space="preserve">交集</w:t>
+            </w:r>
+          </w:p>
+        </w:tc>
+        <w:tc>
+          <w:tcPr/>
+          <w:p>
+            <w:pPr>
+              <w:pStyle w:val="Compact"/>
+              <w:jc w:val="left"/>
+            </w:pPr>
+            <w:r>
+              <w:t xml:space="preserve">接受（且缺口是两个官方系统之间的）</w:t>
             </w:r>
           </w:p>
         </w:tc>
@@ -1924,43 +1035,72 @@
               <w:jc w:val="left"/>
             </w:pPr>
             <w:r>
-              <w:t xml:space="preserve">官方公开库 与 官方工作簿 的交集</w:t>
-            </w:r>
-          </w:p>
-        </w:tc>
-        <w:tc>
-          <w:tcPr/>
-          <w:p>
-            <w:pPr>
-              <w:pStyle w:val="Compact"/>
-              <w:jc w:val="left"/>
-            </w:pPr>
-            <w:r>
-              <w:t xml:space="preserve">212 / 341 门</w:t>
-            </w:r>
-          </w:p>
-        </w:tc>
-        <w:tc>
-          <w:tcPr/>
-          <w:p>
-            <w:pPr>
-              <w:pStyle w:val="Compact"/>
-              <w:jc w:val="left"/>
-            </w:pPr>
-            <w:r>
-              <w:t xml:space="preserve">按课程编码联接两份冻结件，均带哈希</w:t>
-            </w:r>
-          </w:p>
-        </w:tc>
-        <w:tc>
-          <w:tcPr/>
-          <w:p>
-            <w:pPr>
-              <w:pStyle w:val="Compact"/>
-              <w:jc w:val="left"/>
-            </w:pPr>
-            <w:r>
-              <w:t xml:space="preserve">2026-09-27</w:t>
+              <w:t xml:space="preserve">时序</w:t>
+            </w:r>
+          </w:p>
+        </w:tc>
+        <w:tc>
+          <w:tcPr/>
+          <w:p>
+            <w:pPr>
+              <w:pStyle w:val="Compact"/>
+              <w:jc w:val="left"/>
+            </w:pPr>
+            <w:r>
+              <w:t xml:space="preserve">把两份容量快照的</w:t>
+            </w:r>
+            <w:r>
+              <w:rPr>
+                <w:bCs/>
+                <w:b/>
+              </w:rPr>
+              <w:t xml:space="preserve">时点</w:t>
+            </w:r>
+            <w:r>
+              <w:t xml:space="preserve">挖出来（备份里的</w:t>
+            </w:r>
+            <w:r>
+              <w:t xml:space="preserve"> </w:t>
+            </w:r>
+            <w:r>
+              <w:rPr>
+                <w:rStyle w:val="VerbatimChar"/>
+              </w:rPr>
+              <w:t xml:space="preserve">exportedAt</w:t>
+            </w:r>
+            <w:r>
+              <w:t xml:space="preserve">）再解释数字差异</w:t>
+            </w:r>
+          </w:p>
+        </w:tc>
+        <w:tc>
+          <w:tcPr/>
+          <w:p>
+            <w:pPr>
+              <w:pStyle w:val="Compact"/>
+              <w:jc w:val="left"/>
+            </w:pPr>
+            <w:r>
+              <w:t xml:space="preserve">9-08 13:07 与 9-27，相差 19 天</w:t>
+            </w:r>
+          </w:p>
+        </w:tc>
+        <w:tc>
+          <w:tcPr/>
+          <w:p>
+            <w:pPr>
+              <w:pStyle w:val="Compact"/>
+              <w:jc w:val="left"/>
+            </w:pPr>
+            <w:r>
+              <w:rPr>
+                <w:bCs/>
+                <w:b/>
+              </w:rPr>
+              <w:t xml:space="preserve">推翻</w:t>
+            </w:r>
+            <w:r>
+              <w:t xml:space="preserve">”数据自相矛盾”的判断</w:t>
             </w:r>
           </w:p>
         </w:tc>
@@ -1974,43 +1114,308 @@
               <w:jc w:val="left"/>
             </w:pPr>
             <w:r>
-              <w:t xml:space="preserve">目标值</w:t>
-            </w:r>
-          </w:p>
-        </w:tc>
-        <w:tc>
-          <w:tcPr/>
-          <w:p>
-            <w:pPr>
-              <w:pStyle w:val="Compact"/>
-              <w:jc w:val="left"/>
-            </w:pPr>
-            <w:r>
-              <w:t xml:space="preserve">&lt; 5 分钟</w:t>
-            </w:r>
-          </w:p>
-        </w:tc>
-        <w:tc>
-          <w:tcPr/>
-          <w:p>
-            <w:pPr>
-              <w:pStyle w:val="Compact"/>
-              <w:jc w:val="left"/>
-            </w:pPr>
-            <w:r>
-              <w:t xml:space="preserve">同一份方案、同一套流程，两个数字才可比</w:t>
-            </w:r>
-          </w:p>
-        </w:tc>
-        <w:tc>
-          <w:tcPr/>
-          <w:p>
-            <w:pPr>
-              <w:pStyle w:val="Compact"/>
-              <w:jc w:val="left"/>
-            </w:pPr>
-            <w:r>
-              <w:t xml:space="preserve">—</w:t>
+              <w:t xml:space="preserve">语义</w:t>
+            </w:r>
+          </w:p>
+        </w:tc>
+        <w:tc>
+          <w:tcPr/>
+          <w:p>
+            <w:pPr>
+              <w:pStyle w:val="Compact"/>
+              <w:jc w:val="left"/>
+            </w:pPr>
+            <w:r>
+              <w:t xml:space="preserve">检查”限选人数”列的全部原始取值形态</w:t>
+            </w:r>
+          </w:p>
+        </w:tc>
+        <w:tc>
+          <w:tcPr/>
+          <w:p>
+            <w:pPr>
+              <w:pStyle w:val="Compact"/>
+              <w:jc w:val="left"/>
+            </w:pPr>
+            <w:r>
+              <w:rPr>
+                <w:rStyle w:val="VerbatimChar"/>
+              </w:rPr>
+              <w:t xml:space="preserve">/</w:t>
+            </w:r>
+            <w:r>
+              <w:t xml:space="preserve"> </w:t>
+            </w:r>
+            <w:r>
+              <w:t xml:space="preserve">= 不设限选，空白 = 未知</w:t>
+            </w:r>
+          </w:p>
+        </w:tc>
+        <w:tc>
+          <w:tcPr/>
+          <w:p>
+            <w:pPr>
+              <w:pStyle w:val="Compact"/>
+              <w:jc w:val="left"/>
+            </w:pPr>
+            <w:r>
+              <w:rPr>
+                <w:bCs/>
+                <w:b/>
+              </w:rPr>
+              <w:t xml:space="preserve">推翻</w:t>
+            </w:r>
+            <w:r>
+              <w:t xml:space="preserve">”坏数据”的判断</w:t>
+            </w:r>
+          </w:p>
+        </w:tc>
+      </w:tr>
+    </w:tbl>
+    <w:p>
+      <w:pPr>
+        <w:pStyle w:val="BodyText"/>
+      </w:pPr>
+      <w:r>
+        <w:rPr>
+          <w:bCs/>
+          <w:b/>
+        </w:rPr>
+        <w:t xml:space="preserve">什么会推翻本稿主张</w:t>
+      </w:r>
+      <w:r>
+        <w:t xml:space="preserve">：如果存在</w:t>
+      </w:r>
+      <w:r>
+        <w:rPr>
+          <w:bCs/>
+          <w:b/>
+        </w:rPr>
+        <w:t xml:space="preserve">某一个</w:t>
+      </w:r>
+      <w:r>
+        <w:t xml:space="preserve">来源，同时给全「校区 + 学期 + 开课周 + 星期节次 + 剩余座位」，那”必须联接”这句话就不成立了。</w:t>
+      </w:r>
+      <w:r>
+        <w:t xml:space="preserve"> </w:t>
+      </w:r>
+      <w:r>
+        <w:t xml:space="preserve">截至 2026-09-27 的实测结论是</w:t>
+      </w:r>
+      <w:r>
+        <w:rPr>
+          <w:bCs/>
+          <w:b/>
+        </w:rPr>
+        <w:t xml:space="preserve">不存在</w:t>
+      </w:r>
+      <w:r>
+        <w:t xml:space="preserve">：官方公开库缺学期，官方工作簿缺周次/节次/容量，第三方缺校区/学期。</w:t>
+      </w:r>
+    </w:p>
+    <w:bookmarkEnd w:id="21"/>
+    <w:bookmarkEnd w:id="22"/>
+    <w:bookmarkStart w:id="23" w:name="利益相关者与流程"/>
+    <w:p>
+      <w:pPr>
+        <w:pStyle w:val="Heading2"/>
+      </w:pPr>
+      <w:r>
+        <w:t xml:space="preserve">2. 利益相关者与流程</w:t>
+      </w:r>
+    </w:p>
+    <w:p>
+      <w:pPr>
+        <w:numPr>
+          <w:ilvl w:val="0"/>
+          <w:numId w:val="1001"/>
+        </w:numPr>
+        <w:pStyle w:val="Compact"/>
+      </w:pPr>
+      <w:r>
+        <w:rPr>
+          <w:bCs/>
+          <w:b/>
+        </w:rPr>
+        <w:t xml:space="preserve">使用者</w:t>
+      </w:r>
+      <w:r>
+        <w:t xml:space="preserve">：我本人——每学期完整走一遍这套流程的那个人。</w:t>
+      </w:r>
+    </w:p>
+    <w:p>
+      <w:pPr>
+        <w:numPr>
+          <w:ilvl w:val="0"/>
+          <w:numId w:val="1001"/>
+        </w:numPr>
+        <w:pStyle w:val="Compact"/>
+      </w:pPr>
+      <w:r>
+        <w:rPr>
+          <w:bCs/>
+          <w:b/>
+        </w:rPr>
+        <w:t xml:space="preserve">受影响的人</w:t>
+      </w:r>
+      <w:r>
+        <w:t xml:space="preserve">：同校区、同规则的同学；导师（课落在哪，直接影响科研时间怎么排）。</w:t>
+      </w:r>
+    </w:p>
+    <w:p>
+      <w:pPr>
+        <w:numPr>
+          <w:ilvl w:val="0"/>
+          <w:numId w:val="1001"/>
+        </w:numPr>
+        <w:pStyle w:val="Compact"/>
+      </w:pPr>
+      <w:r>
+        <w:rPr>
+          <w:bCs/>
+          <w:b/>
+        </w:rPr>
+        <w:t xml:space="preserve">决策方</w:t>
+      </w:r>
+      <w:r>
+        <w:t xml:space="preserve">：开课院系和教务——它们发布计划、制定规则，</w:t>
+      </w:r>
+      <w:r>
+        <w:rPr>
+          <w:bCs/>
+          <w:b/>
+        </w:rPr>
+        <w:t xml:space="preserve">规则一改，整道题重开</w:t>
+      </w:r>
+      <w:r>
+        <w:t xml:space="preserve">。</w:t>
+      </w:r>
+    </w:p>
+    <w:p>
+      <w:pPr>
+        <w:numPr>
+          <w:ilvl w:val="0"/>
+          <w:numId w:val="1001"/>
+        </w:numPr>
+        <w:pStyle w:val="Compact"/>
+      </w:pPr>
+      <w:r>
+        <w:rPr>
+          <w:bCs/>
+          <w:b/>
+        </w:rPr>
+        <w:t xml:space="preserve">约束</w:t>
+      </w:r>
+      <w:r>
+        <w:t xml:space="preserve">：只能玉泉路（编码第 18 位 =</w:t>
+      </w:r>
+      <w:r>
+        <w:t xml:space="preserve"> </w:t>
+      </w:r>
+      <w:r>
+        <w:rPr>
+          <w:rStyle w:val="VerbatimChar"/>
+        </w:rPr>
+        <w:t xml:space="preserve">Y</w:t>
+      </w:r>
+      <w:r>
+        <w:t xml:space="preserve">）；不跨校区；学位课学分有下限；窗口内先到先得；</w:t>
+      </w:r>
+      <w:r>
+        <w:rPr>
+          <w:bCs/>
+          <w:b/>
+        </w:rPr>
+        <w:t xml:space="preserve">每个来源都只是某个时点的快照</w:t>
+      </w:r>
+      <w:r>
+        <w:t xml:space="preserve">。</w:t>
+      </w:r>
+    </w:p>
+    <w:p>
+      <w:pPr>
+        <w:numPr>
+          <w:ilvl w:val="0"/>
+          <w:numId w:val="1001"/>
+        </w:numPr>
+        <w:pStyle w:val="Compact"/>
+      </w:pPr>
+      <w:r>
+        <w:rPr>
+          <w:bCs/>
+          <w:b/>
+        </w:rPr>
+        <w:t xml:space="preserve">现状</w:t>
+      </w:r>
+      <w:r>
+        <w:t xml:space="preserve">：全靠手工，没有任何工具支持。</w:t>
+      </w:r>
+    </w:p>
+    <w:tbl>
+      <w:tblPr>
+        <w:tblStyle w:val="Table"/>
+        <w:tblW w:type="auto" w:w="0"/>
+        <w:tblLook w:firstRow="1" w:lastRow="0" w:firstColumn="0" w:lastColumn="0" w:noHBand="0" w:noVBand="0" w:val="0020"/>
+        <w:jc w:val="start"/>
+        <w:tblBorders>
+          <w:top w:val="single" w:sz="4" w:color="9AA0AE"/>
+          <w:left w:val="single" w:sz="4" w:color="9AA0AE"/>
+          <w:bottom w:val="single" w:sz="4" w:color="9AA0AE"/>
+          <w:right w:val="single" w:sz="4" w:color="9AA0AE"/>
+          <w:insideH w:val="single" w:sz="4" w:color="9AA0AE"/>
+          <w:insideV w:val="single" w:sz="4" w:color="9AA0AE"/>
+        </w:tblBorders>
+        <w:tblW w:w="5000" w:type="pct"/>
+        <w:tblLayout w:type="autofit"/>
+      </w:tblPr>
+      <w:tblGrid>
+        <w:gridCol w:w="2640"/>
+        <w:gridCol w:w="2640"/>
+        <w:gridCol w:w="2640"/>
+      </w:tblGrid>
+      <w:tr>
+        <w:trPr>
+          <w:tblHeader w:val="true"/>
+        </w:trPr>
+        <w:tc>
+          <w:tcPr>
+            <w:shd w:val="clear" w:fill="F1F2F6"/>
+          </w:tcPr>
+          <w:p>
+            <w:pPr>
+              <w:pStyle w:val="Compact"/>
+              <w:jc w:val="left"/>
+            </w:pPr>
+            <w:r>
+              <w:t xml:space="preserve">步骤</w:t>
+            </w:r>
+          </w:p>
+        </w:tc>
+        <w:tc>
+          <w:tcPr>
+            <w:shd w:val="clear" w:fill="F1F2F6"/>
+          </w:tcPr>
+          <w:p>
+            <w:pPr>
+              <w:pStyle w:val="Compact"/>
+              <w:jc w:val="left"/>
+            </w:pPr>
+            <w:r>
+              <w:t xml:space="preserve">做什么</w:t>
+            </w:r>
+          </w:p>
+        </w:tc>
+        <w:tc>
+          <w:tcPr>
+            <w:shd w:val="clear" w:fill="F1F2F6"/>
+          </w:tcPr>
+          <w:p>
+            <w:pPr>
+              <w:pStyle w:val="Compact"/>
+              <w:jc w:val="left"/>
+            </w:pPr>
+            <w:r>
+              <w:t xml:space="preserve">依赖 / 备注</w:t>
             </w:r>
           </w:p>
         </w:tc>
@@ -2024,43 +1429,270 @@
               <w:jc w:val="left"/>
             </w:pPr>
             <w:r>
-              <w:t xml:space="preserve">失败的代价</w:t>
-            </w:r>
-          </w:p>
-        </w:tc>
-        <w:tc>
-          <w:tcPr/>
-          <w:p>
-            <w:pPr>
-              <w:pStyle w:val="Compact"/>
-              <w:jc w:val="left"/>
-            </w:pPr>
-            <w:r>
-              <w:t xml:space="preserve">冲突（要重排）／学分不够（对不上培养方案）／窗口里丢席位</w:t>
-            </w:r>
-          </w:p>
-        </w:tc>
-        <w:tc>
-          <w:tcPr/>
-          <w:p>
-            <w:pPr>
-              <w:pStyle w:val="Compact"/>
-              <w:jc w:val="left"/>
-            </w:pPr>
-            <w:r>
-              <w:t xml:space="preserve">只陈述后果，不编概率</w:t>
-            </w:r>
-          </w:p>
-        </w:tc>
-        <w:tc>
-          <w:tcPr/>
-          <w:p>
-            <w:pPr>
-              <w:pStyle w:val="Compact"/>
-              <w:jc w:val="left"/>
-            </w:pPr>
-            <w:r>
-              <w:t xml:space="preserve">—</w:t>
+              <w:t xml:space="preserve">1</w:t>
+            </w:r>
+          </w:p>
+        </w:tc>
+        <w:tc>
+          <w:tcPr/>
+          <w:p>
+            <w:pPr>
+              <w:pStyle w:val="Compact"/>
+              <w:jc w:val="left"/>
+            </w:pPr>
+            <w:r>
+              <w:t xml:space="preserve">读培养方案要求</w:t>
+            </w:r>
+          </w:p>
+        </w:tc>
+        <w:tc>
+          <w:tcPr/>
+          <w:p>
+            <w:pPr>
+              <w:pStyle w:val="Compact"/>
+              <w:jc w:val="left"/>
+            </w:pPr>
+            <w:r>
+              <w:t xml:space="preserve">任何数据源里都没有——只能人工输入</w:t>
+            </w:r>
+          </w:p>
+        </w:tc>
+      </w:tr>
+      <w:tr>
+        <w:tc>
+          <w:tcPr/>
+          <w:p>
+            <w:pPr>
+              <w:pStyle w:val="Compact"/>
+              <w:jc w:val="left"/>
+            </w:pPr>
+            <w:r>
+              <w:t xml:space="preserve">2</w:t>
+            </w:r>
+          </w:p>
+        </w:tc>
+        <w:tc>
+          <w:tcPr/>
+          <w:p>
+            <w:pPr>
+              <w:pStyle w:val="Compact"/>
+              <w:jc w:val="left"/>
+            </w:pPr>
+            <w:r>
+              <w:t xml:space="preserve">凑出候选课 + 它们的时间</w:t>
+            </w:r>
+          </w:p>
+        </w:tc>
+        <w:tc>
+          <w:tcPr/>
+          <w:p>
+            <w:pPr>
+              <w:pStyle w:val="Compact"/>
+              <w:jc w:val="left"/>
+            </w:pPr>
+            <w:r>
+              <w:t xml:space="preserve">三个来源，手工对接（E3、E4、E5）</w:t>
+            </w:r>
+          </w:p>
+        </w:tc>
+      </w:tr>
+      <w:tr>
+        <w:tc>
+          <w:tcPr/>
+          <w:p>
+            <w:pPr>
+              <w:pStyle w:val="Compact"/>
+              <w:jc w:val="left"/>
+            </w:pPr>
+            <w:r>
+              <w:t xml:space="preserve">3</w:t>
+            </w:r>
+          </w:p>
+        </w:tc>
+        <w:tc>
+          <w:tcPr/>
+          <w:p>
+            <w:pPr>
+              <w:pStyle w:val="Compact"/>
+              <w:jc w:val="left"/>
+            </w:pPr>
+            <w:r>
+              <w:t xml:space="preserve">逐门收集容量 / 已选</w:t>
+            </w:r>
+          </w:p>
+        </w:tc>
+        <w:tc>
+          <w:tcPr/>
+          <w:p>
+            <w:pPr>
+              <w:pStyle w:val="Compact"/>
+              <w:jc w:val="left"/>
+            </w:pPr>
+            <w:r>
+              <w:t xml:space="preserve">只有官方公开库和第三方有（E4、E5）</w:t>
+            </w:r>
+          </w:p>
+        </w:tc>
+      </w:tr>
+      <w:tr>
+        <w:tc>
+          <w:tcPr/>
+          <w:p>
+            <w:pPr>
+              <w:pStyle w:val="Compact"/>
+              <w:jc w:val="left"/>
+            </w:pPr>
+            <w:r>
+              <w:t xml:space="preserve">4</w:t>
+            </w:r>
+          </w:p>
+        </w:tc>
+        <w:tc>
+          <w:tcPr/>
+          <w:p>
+            <w:pPr>
+              <w:pStyle w:val="Compact"/>
+              <w:jc w:val="left"/>
+            </w:pPr>
+            <w:r>
+              <w:rPr>
+                <w:bCs/>
+                <w:b/>
+              </w:rPr>
+              <w:t xml:space="preserve">查冲突</w:t>
+            </w:r>
+          </w:p>
+        </w:tc>
+        <w:tc>
+          <w:tcPr/>
+          <w:p>
+            <w:pPr>
+              <w:pStyle w:val="Compact"/>
+              <w:jc w:val="left"/>
+            </w:pPr>
+            <w:r>
+              <w:rPr>
+                <w:bCs/>
+                <w:b/>
+              </w:rPr>
+              <w:t xml:space="preserve">★断点：三个维度同时判</w:t>
+            </w:r>
+            <w:r>
+              <w:t xml:space="preserve">（E1、E3、E4）</w:t>
+            </w:r>
+          </w:p>
+        </w:tc>
+      </w:tr>
+      <w:tr>
+        <w:tc>
+          <w:tcPr/>
+          <w:p>
+            <w:pPr>
+              <w:pStyle w:val="Compact"/>
+              <w:jc w:val="left"/>
+            </w:pPr>
+            <w:r>
+              <w:t xml:space="preserve">5</w:t>
+            </w:r>
+          </w:p>
+        </w:tc>
+        <w:tc>
+          <w:tcPr/>
+          <w:p>
+            <w:pPr>
+              <w:pStyle w:val="Compact"/>
+              <w:jc w:val="left"/>
+            </w:pPr>
+            <w:r>
+              <w:t xml:space="preserve">决定按什么顺序去抢</w:t>
+            </w:r>
+          </w:p>
+        </w:tc>
+        <w:tc>
+          <w:tcPr/>
+          <w:p>
+            <w:pPr>
+              <w:pStyle w:val="Compact"/>
+              <w:jc w:val="left"/>
+            </w:pPr>
+            <w:r>
+              <w:t xml:space="preserve">另一个完全不同的排序问题（E5 + 优先级规则）</w:t>
+            </w:r>
+          </w:p>
+        </w:tc>
+      </w:tr>
+      <w:tr>
+        <w:tc>
+          <w:tcPr/>
+          <w:p>
+            <w:pPr>
+              <w:pStyle w:val="Compact"/>
+              <w:jc w:val="left"/>
+            </w:pPr>
+            <w:r>
+              <w:t xml:space="preserve">6</w:t>
+            </w:r>
+          </w:p>
+        </w:tc>
+        <w:tc>
+          <w:tcPr/>
+          <w:p>
+            <w:pPr>
+              <w:pStyle w:val="Compact"/>
+              <w:jc w:val="left"/>
+            </w:pPr>
+            <w:r>
+              <w:t xml:space="preserve">在选课窗口里提交</w:t>
+            </w:r>
+          </w:p>
+        </w:tc>
+        <w:tc>
+          <w:tcPr/>
+          <w:p>
+            <w:pPr>
+              <w:pStyle w:val="Compact"/>
+              <w:jc w:val="left"/>
+            </w:pPr>
+            <w:r>
+              <w:t xml:space="preserve">先到先得；失败就得重排（E2）</w:t>
+            </w:r>
+          </w:p>
+        </w:tc>
+      </w:tr>
+      <w:tr>
+        <w:tc>
+          <w:tcPr/>
+          <w:p>
+            <w:pPr>
+              <w:pStyle w:val="Compact"/>
+              <w:jc w:val="left"/>
+            </w:pPr>
+            <w:r>
+              <w:t xml:space="preserve">7</w:t>
+            </w:r>
+          </w:p>
+        </w:tc>
+        <w:tc>
+          <w:tcPr/>
+          <w:p>
+            <w:pPr>
+              <w:pStyle w:val="Compact"/>
+              <w:jc w:val="left"/>
+            </w:pPr>
+            <w:r>
+              <w:t xml:space="preserve">没抢到的重新排</w:t>
+            </w:r>
+          </w:p>
+        </w:tc>
+        <w:tc>
+          <w:tcPr/>
+          <w:p>
+            <w:pPr>
+              <w:pStyle w:val="Compact"/>
+              <w:jc w:val="left"/>
+            </w:pPr>
+            <w:r>
+              <w:t xml:space="preserve">回到第 4 步，整张表重查（E1）</w:t>
             </w:r>
           </w:p>
         </w:tc>
@@ -2075,30 +1707,531 @@
           <w:bCs/>
           <w:b/>
         </w:rPr>
-        <w:t xml:space="preserve">诚实性说明</w:t>
-      </w:r>
-      <w:r>
-        <w:t xml:space="preserve">：不声称”漏掉过几次冲突”。到目前为止每次改完都完整重查过，所以</w:t>
-      </w:r>
-      <w:r>
-        <w:rPr>
-          <w:bCs/>
-          <w:b/>
-        </w:rPr>
-        <w:t xml:space="preserve">没有已知的漏检</w:t>
-      </w:r>
-      <w:r>
-        <w:t xml:space="preserve">，代价就锚在”重复劳动”上，而不是编一个错误次数。</w:t>
+        <w:t xml:space="preserve">最大的断点在第 2–5 步。</w:t>
+      </w:r>
+      <w:r>
+        <w:t xml:space="preserve">一次冲突要同时满足</w:t>
+      </w:r>
+      <w:r>
+        <w:rPr>
+          <w:bCs/>
+          <w:b/>
+        </w:rPr>
+        <w:t xml:space="preserve">同一星期 + 节次重叠 + 周次区间重叠</w:t>
+      </w:r>
+      <w:r>
+        <w:t xml:space="preserve">这三个条件；两份官方工作簿既没有周次也没有星期节次，而唯一同时有这两个字段的来源没有校区，所以拼输入的过程就是拼几个</w:t>
+      </w:r>
+      <w:r>
+        <w:rPr>
+          <w:bCs/>
+          <w:b/>
+        </w:rPr>
+        <w:t xml:space="preserve">只部分重叠</w:t>
+      </w:r>
+      <w:r>
+        <w:t xml:space="preserve">的来源。</w:t>
+      </w:r>
+    </w:p>
+    <w:bookmarkEnd w:id="23"/>
+    <w:bookmarkStart w:id="24" w:name="问题与价值陈述"/>
+    <w:p>
+      <w:pPr>
+        <w:pStyle w:val="Heading2"/>
+      </w:pPr>
+      <w:r>
+        <w:t xml:space="preserve">3. 问题与价值陈述</w:t>
+      </w:r>
+    </w:p>
+    <w:p>
+      <w:pPr>
+        <w:pStyle w:val="FirstParagraph"/>
+      </w:pPr>
+      <w:r>
+        <w:rPr>
+          <w:bCs/>
+          <w:b/>
+        </w:rPr>
+        <w:t xml:space="preserve">谁、在哪、多频繁。</w:t>
+      </w:r>
+      <w:r>
+        <w:t xml:space="preserve">每个选课季，我要在一个</w:t>
+      </w:r>
+      <w:r>
+        <w:rPr>
+          <w:bCs/>
+          <w:b/>
+        </w:rPr>
+        <w:t xml:space="preserve">受校区限制的课池</w:t>
+      </w:r>
+      <w:r>
+        <w:t xml:space="preserve">里，凑出十来门课组成一个学期，同时满足培养方案的学分要求。课池有多大：官方工作簿记了玉泉路 414 门，公开库 341 门，</w:t>
+      </w:r>
+      <w:r>
+        <w:rPr>
+          <w:bCs/>
+          <w:b/>
+        </w:rPr>
+        <w:t xml:space="preserve">两边都有的只有 212 门</w:t>
+      </w:r>
+      <w:r>
+        <w:t xml:space="preserve">。从发布到封网只有几天，方案要在这几天里反复改。</w:t>
+      </w:r>
+    </w:p>
+    <w:p>
+      <w:pPr>
+        <w:pStyle w:val="BodyText"/>
+      </w:pPr>
+      <w:r>
+        <w:rPr>
+          <w:bCs/>
+          <w:b/>
+        </w:rPr>
+        <w:t xml:space="preserve">痛点一：字段被拆在不同来源里。</w:t>
+      </w:r>
+    </w:p>
+    <w:p>
+      <w:pPr>
+        <w:numPr>
+          <w:ilvl w:val="0"/>
+          <w:numId w:val="1002"/>
+        </w:numPr>
+        <w:pStyle w:val="Compact"/>
+      </w:pPr>
+      <w:r>
+        <w:t xml:space="preserve">官方工作簿（4,877 条）有校区、学期、属性、学分，但玉泉路那 732 条里</w:t>
+      </w:r>
+      <w:r>
+        <w:rPr>
+          <w:bCs/>
+          <w:b/>
+        </w:rPr>
+        <w:t xml:space="preserve">开课周 0 条、星期节次 0 条</w:t>
+      </w:r>
+      <w:r>
+        <w:t xml:space="preserve">——导入器自己报了 4 次。</w:t>
+      </w:r>
+    </w:p>
+    <w:p>
+      <w:pPr>
+        <w:numPr>
+          <w:ilvl w:val="0"/>
+          <w:numId w:val="1002"/>
+        </w:numPr>
+        <w:pStyle w:val="Compact"/>
+      </w:pPr>
+      <w:r>
+        <w:t xml:space="preserve">官方公开库有校区、限选/已选，详情页还有星期/节次/周次——</w:t>
+      </w:r>
+      <w:r>
+        <w:rPr>
+          <w:bCs/>
+          <w:b/>
+        </w:rPr>
+        <w:t xml:space="preserve">可它不按课程给学期</w:t>
+      </w:r>
+      <w:r>
+        <w:t xml:space="preserve">。</w:t>
+      </w:r>
+    </w:p>
+    <w:p>
+      <w:pPr>
+        <w:numPr>
+          <w:ilvl w:val="0"/>
+          <w:numId w:val="1002"/>
+        </w:numPr>
+        <w:pStyle w:val="Compact"/>
+      </w:pPr>
+      <w:r>
+        <w:t xml:space="preserve">第三方库有星期/节次/周次/容量，但</w:t>
+      </w:r>
+      <w:r>
+        <w:rPr>
+          <w:bCs/>
+          <w:b/>
+        </w:rPr>
+        <w:t xml:space="preserve">没有校区字段</w:t>
+      </w:r>
+      <w:r>
+        <w:t xml:space="preserve">，玉泉路子集只能靠”编码第 18 位 = Y”这条规则去认，而且它也不记学期。</w:t>
+      </w:r>
+    </w:p>
+    <w:p>
+      <w:pPr>
+        <w:numPr>
+          <w:ilvl w:val="0"/>
+          <w:numId w:val="1002"/>
+        </w:numPr>
+        <w:pStyle w:val="Compact"/>
+      </w:pPr>
+      <w:r>
+        <w:t xml:space="preserve">两边一接：</w:t>
+      </w:r>
+      <w:r>
+        <w:rPr>
+          <w:bCs/>
+          <w:b/>
+        </w:rPr>
+        <w:t xml:space="preserve">129 门查不到学期、202 门查不到时间和容量</w:t>
+      </w:r>
+      <w:r>
+        <w:t xml:space="preserve">。</w:t>
+      </w:r>
+    </w:p>
+    <w:p>
+      <w:pPr>
+        <w:pStyle w:val="FirstParagraph"/>
+      </w:pPr>
+      <w:r>
+        <w:rPr>
+          <w:bCs/>
+          <w:b/>
+        </w:rPr>
+        <w:t xml:space="preserve">痛点一之补：两个来源对不上，而且错的那一方看起来更”完整”。</w:t>
+      </w:r>
+      <w:r>
+        <w:t xml:space="preserve"> </w:t>
+      </w:r>
+      <w:r>
+        <w:t xml:space="preserve">第三方快照写”海洋声学：周日第 5–7 节，</w:t>
+      </w:r>
+      <w:r>
+        <w:rPr>
+          <w:bCs/>
+          <w:b/>
+        </w:rPr>
+        <w:t xml:space="preserve">每周</w:t>
+      </w:r>
+      <w:r>
+        <w:t xml:space="preserve">”，官方</w:t>
+      </w:r>
+      <w:r>
+        <w:t xml:space="preserve"> </w:t>
+      </w:r>
+      <w:r>
+        <w:rPr>
+          <w:rStyle w:val="VerbatimChar"/>
+        </w:rPr>
+        <w:t xml:space="preserve">coursetime</w:t>
+      </w:r>
+      <w:r>
+        <w:t xml:space="preserve"> </w:t>
+      </w:r>
+      <w:r>
+        <w:t xml:space="preserve">详情页写”</w:t>
+      </w:r>
+      <w:r>
+        <w:rPr>
+          <w:bCs/>
+          <w:b/>
+        </w:rPr>
+        <w:t xml:space="preserve">周日只有第 3 周一次</w:t>
+      </w:r>
+      <w:r>
+        <w:t xml:space="preserve">”；同一轮实测里，模式识别与自然辩证法的周六课</w:t>
+      </w:r>
+      <w:r>
+        <w:rPr>
+          <w:bCs/>
+          <w:b/>
+        </w:rPr>
+        <w:t xml:space="preserve">都只有第 6 周</w:t>
+      </w:r>
+      <w:r>
+        <w:t xml:space="preserve">。快照的”每周”读起来比官方的”仅第 3 周”更像一条完整排课记录，</w:t>
+      </w:r>
+      <w:r>
+        <w:rPr>
+          <w:bCs/>
+          <w:b/>
+        </w:rPr>
+        <w:t xml:space="preserve">因此更容易被采信</w:t>
+      </w:r>
+      <w:r>
+        <w:t xml:space="preserve">——一旦采信，三维冲突检查会在第 4、5、6…周反复</w:t>
+      </w:r>
+      <w:r>
+        <w:rPr>
+          <w:bCs/>
+          <w:b/>
+        </w:rPr>
+        <w:t xml:space="preserve">误报</w:t>
+      </w:r>
+      <w:r>
+        <w:t xml:space="preserve">，或者反过来漏掉真实的单周占用。</w:t>
+      </w:r>
+    </w:p>
+    <w:p>
+      <w:pPr>
+        <w:pStyle w:val="BodyText"/>
+      </w:pPr>
+      <w:r>
+        <w:rPr>
+          <w:bCs/>
+          <w:b/>
+        </w:rPr>
+        <w:t xml:space="preserve">痛点二：检查本身是三维的。</w:t>
+      </w:r>
+      <w:r>
+        <w:t xml:space="preserve">一次冲突要</w:t>
+      </w:r>
+      <w:r>
+        <w:rPr>
+          <w:bCs/>
+          <w:b/>
+        </w:rPr>
+        <w:t xml:space="preserve">同一星期、节次重叠、周次区间重叠</w:t>
+      </w:r>
+      <w:r>
+        <w:t xml:space="preserve">三者同时成立。实测方案里的周次占用从 5 周到 19 周不等；2026-09-05 那版方案里有个格子（</w:t>
+      </w:r>
+      <w:r>
+        <w:rPr>
+          <w:rStyle w:val="VerbatimChar"/>
+        </w:rPr>
+        <w:t xml:space="preserve">C5</w:t>
+      </w:r>
+      <w:r>
+        <w:t xml:space="preserve">，周二第 1–4 节）在第 11–18 周是《新时代中国特色社会主义理论与实践》，在第 2–5 周和第 7–10 周是《自然辩证法概论》。</w:t>
+      </w:r>
+      <w:r>
+        <w:rPr>
+          <w:bCs/>
+          <w:b/>
+        </w:rPr>
+        <w:t xml:space="preserve">只按”星期 + 节次”判，会误报成冲突；只有把周次算进来才知道不是冲突。</w:t>
+      </w:r>
+    </w:p>
+    <w:p>
+      <w:pPr>
+        <w:pStyle w:val="BodyText"/>
+      </w:pPr>
+      <w:r>
+        <w:rPr>
+          <w:bCs/>
+          <w:b/>
+        </w:rPr>
+        <w:t xml:space="preserve">现在的土办法和代价。</w:t>
+      </w:r>
+      <w:r>
+        <w:t xml:space="preserve">把整学期的周表一张张用眼睛读，只要任何一门课动一下，就得把整张表重新查一遍。两版方案之间：</w:t>
+      </w:r>
+      <w:r>
+        <w:rPr>
+          <w:bCs/>
+          <w:b/>
+        </w:rPr>
+        <w:t xml:space="preserve">22 个格子被删、45 个新增、0 个原地修改</w:t>
+      </w:r>
+      <w:r>
+        <w:t xml:space="preserve">——方案是重排出来的，每重排一次就强制重查一次。</w:t>
+      </w:r>
+    </w:p>
+    <w:p>
+      <w:pPr>
+        <w:pStyle w:val="BodyText"/>
+      </w:pPr>
+      <w:r>
+        <w:rPr>
+          <w:bCs/>
+          <w:b/>
+        </w:rPr>
+        <w:t xml:space="preserve">干预方案与价值度量。</w:t>
+      </w:r>
+      <w:r>
+        <w:t xml:space="preserve">把来源按课程编码接成</w:t>
+      </w:r>
+      <w:r>
+        <w:rPr>
+          <w:bCs/>
+          <w:b/>
+        </w:rPr>
+        <w:t xml:space="preserve">一份冻结输入</w:t>
+      </w:r>
+      <w:r>
+        <w:t xml:space="preserve">；做三维冲突检测；输出</w:t>
+      </w:r>
+      <w:r>
+        <w:rPr>
+          <w:bCs/>
+          <w:b/>
+        </w:rPr>
+        <w:t xml:space="preserve">两张不同的清单</w:t>
+      </w:r>
+      <w:r>
+        <w:t xml:space="preserve">——一份无冲突排课方案，一份按”不可延性 × 座位紧张度”排的抢课顺序。价值用同一套输入、同一套流程来量：现在手工走一遍要</w:t>
+      </w:r>
+      <w:r>
+        <w:t xml:space="preserve"> </w:t>
+      </w:r>
+      <w:r>
+        <w:rPr>
+          <w:bCs/>
+          <w:b/>
+        </w:rPr>
+        <w:t xml:space="preserve">[待填：__ 分钟，掐表，__ 门课]</w:t>
+      </w:r>
+      <w:r>
+        <w:t xml:space="preserve">，目标是压到 5 分钟以内。</w:t>
+      </w:r>
+    </w:p>
+    <w:p>
+      <w:pPr>
+        <w:pStyle w:val="BodyText"/>
+      </w:pPr>
+      <w:r>
+        <w:rPr>
+          <w:bCs/>
+          <w:b/>
+        </w:rPr>
+        <w:t xml:space="preserve">还不确定的地方。</w:t>
+      </w:r>
+    </w:p>
+    <w:p>
+      <w:pPr>
+        <w:numPr>
+          <w:ilvl w:val="0"/>
+          <w:numId w:val="1003"/>
+        </w:numPr>
+        <w:pStyle w:val="Compact"/>
+      </w:pPr>
+      <w:r>
+        <w:t xml:space="preserve">那些查不到学期的课，到底能不能从某个来源补出来，还是必须每学期人工录一次——</w:t>
+      </w:r>
+      <w:r>
+        <w:rPr>
+          <w:bCs/>
+          <w:b/>
+        </w:rPr>
+        <w:t xml:space="preserve">这一条会决定整个设计</w:t>
+      </w:r>
+      <w:r>
+        <w:t xml:space="preserve">。</w:t>
+      </w:r>
+    </w:p>
+    <w:p>
+      <w:pPr>
+        <w:numPr>
+          <w:ilvl w:val="0"/>
+          <w:numId w:val="1003"/>
+        </w:numPr>
+        <w:pStyle w:val="Compact"/>
+      </w:pPr>
+      <w:r>
+        <w:t xml:space="preserve">这个痛点除我之外有多普遍（E1 目前只是我一个人的记录 + 一位同学的说法）。</w:t>
+      </w:r>
+    </w:p>
+    <w:p>
+      <w:pPr>
+        <w:numPr>
+          <w:ilvl w:val="0"/>
+          <w:numId w:val="1003"/>
+        </w:numPr>
+        <w:pStyle w:val="Compact"/>
+      </w:pPr>
+      <w:r>
+        <w:t xml:space="preserve">官方数据里”限选人数”为</w:t>
+      </w:r>
+      <w:r>
+        <w:rPr>
+          <w:bCs/>
+          <w:b/>
+        </w:rPr>
+        <w:t xml:space="preserve">空</w:t>
+      </w:r>
+      <w:r>
+        <w:t xml:space="preserve">和显示为</w:t>
+      </w:r>
+      <w:r>
+        <w:t xml:space="preserve"> </w:t>
+      </w:r>
+      <w:r>
+        <w:rPr>
+          <w:rStyle w:val="VerbatimChar"/>
+          <w:bCs/>
+          <w:b/>
+        </w:rPr>
+        <w:t xml:space="preserve">/</w:t>
+      </w:r>
+      <w:r>
+        <w:t xml:space="preserve"> </w:t>
+      </w:r>
+      <w:r>
+        <w:t xml:space="preserve">是两回事：</w:t>
+      </w:r>
+      <w:r>
+        <w:rPr>
+          <w:bCs/>
+          <w:b/>
+        </w:rPr>
+        <w:t xml:space="preserve">实测</w:t>
+      </w:r>
+      <w:r>
+        <w:rPr>
+          <w:bCs/>
+          <w:b/>
+        </w:rPr>
+        <w:t xml:space="preserve"> </w:t>
+      </w:r>
+      <w:r>
+        <w:rPr>
+          <w:rStyle w:val="VerbatimChar"/>
+          <w:bCs/>
+          <w:b/>
+        </w:rPr>
+        <w:t xml:space="preserve">/</w:t>
+      </w:r>
+      <w:r>
+        <w:rPr>
+          <w:bCs/>
+          <w:b/>
+        </w:rPr>
+        <w:t xml:space="preserve">（斜杠）表示”不设限选人数”</w:t>
+      </w:r>
+      <w:r>
+        <w:t xml:space="preserve">，不是缺数据；真正为空的才算”未知”。</w:t>
+      </w:r>
+      <w:r>
+        <w:rPr>
+          <w:bCs/>
+          <w:b/>
+        </w:rPr>
+        <w:t xml:space="preserve">未知一律当”未知”，绝不当”不限”。</w:t>
+      </w:r>
+    </w:p>
+    <w:p>
+      <w:pPr>
+        <w:pStyle w:val="FirstParagraph"/>
+      </w:pPr>
+      <w:r>
+        <w:rPr>
+          <w:bCs/>
+          <w:b/>
+        </w:rPr>
+        <w:t xml:space="preserve">为什么这是”一学期规模的活”而不是”一小时脚本”。</w:t>
+      </w:r>
+      <w:r>
+        <w:t xml:space="preserve">四件事撑着：把三个只部分重叠的来源接起来、而且要可复现地接；把三维冲突规则做对、可测；把</w:t>
+      </w:r>
+      <w:r>
+        <w:rPr>
+          <w:bCs/>
+          <w:b/>
+        </w:rPr>
+        <w:t xml:space="preserve">两个序</w:t>
+      </w:r>
+      <w:r>
+        <w:t xml:space="preserve">分开（排课方案 vs 抢课顺序），别用一个问题的答案去回答另一个；以及让”拒绝理由”写得足够清楚，让人敢信它的输出。</w:t>
       </w:r>
     </w:p>
     <w:bookmarkEnd w:id="24"/>
-    <w:bookmarkStart w:id="25" w:name="不写软件的其他办法"/>
+    <w:bookmarkStart w:id="25" w:name="量化"/>
     <w:p>
       <w:pPr>
         <w:pStyle w:val="Heading2"/>
       </w:pPr>
       <w:r>
-        <w:t xml:space="preserve">5. 不写软件的其他办法</w:t>
+        <w:t xml:space="preserve">4. 量化</w:t>
       </w:r>
     </w:p>
     <w:tbl>
@@ -2139,7 +2272,7 @@
               <w:jc w:val="left"/>
             </w:pPr>
             <w:r>
-              <w:t xml:space="preserve">办法</w:t>
+              <w:t xml:space="preserve">度量的东西</w:t>
             </w:r>
           </w:p>
         </w:tc>
@@ -2153,7 +2286,7 @@
               <w:jc w:val="left"/>
             </w:pPr>
             <w:r>
-              <w:t xml:space="preserve">怎么做</w:t>
+              <w:t xml:space="preserve">数值</w:t>
             </w:r>
           </w:p>
         </w:tc>
@@ -2167,7 +2300,7 @@
               <w:jc w:val="left"/>
             </w:pPr>
             <w:r>
-              <w:t xml:space="preserve">成本</w:t>
+              <w:t xml:space="preserve">怎么测的</w:t>
             </w:r>
           </w:p>
         </w:tc>
@@ -2181,7 +2314,7 @@
               <w:jc w:val="left"/>
             </w:pPr>
             <w:r>
-              <w:t xml:space="preserve">为什么不够（要有证据）</w:t>
+              <w:t xml:space="preserve">日期</w:t>
             </w:r>
           </w:p>
         </w:tc>
@@ -2195,19 +2328,35 @@
               <w:jc w:val="left"/>
             </w:pPr>
             <w:r>
-              <w:t xml:space="preserve">A. Excel 模板 + 打印出来的课表</w:t>
-            </w:r>
-          </w:p>
-        </w:tc>
-        <w:tc>
-          <w:tcPr/>
-          <w:p>
-            <w:pPr>
-              <w:pStyle w:val="Compact"/>
-              <w:jc w:val="left"/>
-            </w:pPr>
-            <w:r>
-              <w:t xml:space="preserve">固定表头，手工填、手工比</w:t>
+              <w:t xml:space="preserve">基线：手工完整查一遍冲突</w:t>
+            </w:r>
+          </w:p>
+        </w:tc>
+        <w:tc>
+          <w:tcPr/>
+          <w:p>
+            <w:pPr>
+              <w:pStyle w:val="Compact"/>
+              <w:jc w:val="left"/>
+            </w:pPr>
+            <w:r>
+              <w:rPr>
+                <w:bCs/>
+                <w:b/>
+              </w:rPr>
+              <w:t xml:space="preserve">[待填：__ 分钟]</w:t>
+            </w:r>
+          </w:p>
+        </w:tc>
+        <w:tc>
+          <w:tcPr/>
+          <w:p>
+            <w:pPr>
+              <w:pStyle w:val="Compact"/>
+              <w:jc w:val="left"/>
+            </w:pPr>
+            <w:r>
+              <w:t xml:space="preserve">对 2026-09-15 那版方案的 [待填：__ 门课] 掐表，跑 3 次</w:t>
             </w:r>
           </w:p>
         </w:tc>
@@ -2220,18 +2369,6 @@
             </w:pPr>
             <w:r>
               <w:t xml:space="preserve">[待填]</w:t>
-            </w:r>
-          </w:p>
-        </w:tc>
-        <w:tc>
-          <w:tcPr/>
-          <w:p>
-            <w:pPr>
-              <w:pStyle w:val="Compact"/>
-              <w:jc w:val="left"/>
-            </w:pPr>
-            <w:r>
-              <w:t xml:space="preserve">三维规则仍然只存在于操作者脑子里；来源每年变、结构还互不一致（E3、E4、E5）</w:t>
             </w:r>
           </w:p>
         </w:tc>
@@ -2245,43 +2382,43 @@
               <w:jc w:val="left"/>
             </w:pPr>
             <w:r>
-              <w:t xml:space="preserve">B. 现成的规划器/课表工具</w:t>
-            </w:r>
-          </w:p>
-        </w:tc>
-        <w:tc>
-          <w:tcPr/>
-          <w:p>
-            <w:pPr>
-              <w:pStyle w:val="Compact"/>
-              <w:jc w:val="left"/>
-            </w:pPr>
-            <w:r>
-              <w:t xml:space="preserve">搜一圈、试一下</w:t>
-            </w:r>
-          </w:p>
-        </w:tc>
-        <w:tc>
-          <w:tcPr/>
-          <w:p>
-            <w:pPr>
-              <w:pStyle w:val="Compact"/>
-              <w:jc w:val="left"/>
-            </w:pPr>
-            <w:r>
-              <w:t xml:space="preserve">[待填]</w:t>
-            </w:r>
-          </w:p>
-        </w:tc>
-        <w:tc>
-          <w:tcPr/>
-          <w:p>
-            <w:pPr>
-              <w:pStyle w:val="Compact"/>
-              <w:jc w:val="left"/>
-            </w:pPr>
-            <w:r>
-              <w:t xml:space="preserve">找到的都是面向”排课/教务”的；没找到能把这几个来源接起来、或带开课周的（检索记录：待补）</w:t>
+              <w:t xml:space="preserve">每学期完整重查次数</w:t>
+            </w:r>
+          </w:p>
+        </w:tc>
+        <w:tc>
+          <w:tcPr/>
+          <w:p>
+            <w:pPr>
+              <w:pStyle w:val="Compact"/>
+              <w:jc w:val="left"/>
+            </w:pPr>
+            <w:r>
+              <w:t xml:space="preserve">≥ 2</w:t>
+            </w:r>
+          </w:p>
+        </w:tc>
+        <w:tc>
+          <w:tcPr/>
+          <w:p>
+            <w:pPr>
+              <w:pStyle w:val="Compact"/>
+              <w:jc w:val="left"/>
+            </w:pPr>
+            <w:r>
+              <w:t xml:space="preserve">两版方案之间存在一次整体重排（E1）</w:t>
+            </w:r>
+          </w:p>
+        </w:tc>
+        <w:tc>
+          <w:tcPr/>
+          <w:p>
+            <w:pPr>
+              <w:pStyle w:val="Compact"/>
+              <w:jc w:val="left"/>
+            </w:pPr>
+            <w:r>
+              <w:t xml:space="preserve">2026-09-25</w:t>
             </w:r>
           </w:p>
         </w:tc>
@@ -2295,31 +2432,231 @@
               <w:jc w:val="left"/>
             </w:pPr>
             <w:r>
-              <w:t xml:space="preserve">C. 本方案</w:t>
-            </w:r>
-          </w:p>
-        </w:tc>
-        <w:tc>
-          <w:tcPr/>
-          <w:p>
-            <w:pPr>
-              <w:pStyle w:val="Compact"/>
-              <w:jc w:val="left"/>
-            </w:pPr>
-            <w:r>
-              <w:t xml:space="preserve">冻结的联接输入 → 三维冲突检测 → 排课方案 + 独立的抢课顺序</w:t>
-            </w:r>
-          </w:p>
-        </w:tc>
-        <w:tc>
-          <w:tcPr/>
-          <w:p>
-            <w:pPr>
-              <w:pStyle w:val="Compact"/>
-              <w:jc w:val="left"/>
-            </w:pPr>
-            <w:r>
-              <w:t xml:space="preserve">一学期的活</w:t>
+              <w:t xml:space="preserve">方案中达到容量 90% 以上的课</w:t>
+            </w:r>
+          </w:p>
+        </w:tc>
+        <w:tc>
+          <w:tcPr/>
+          <w:p>
+            <w:pPr>
+              <w:pStyle w:val="Compact"/>
+              <w:jc w:val="left"/>
+            </w:pPr>
+            <w:r>
+              <w:t xml:space="preserve">13 门里 8 门</w:t>
+            </w:r>
+          </w:p>
+        </w:tc>
+        <w:tc>
+          <w:tcPr/>
+          <w:p>
+            <w:pPr>
+              <w:pStyle w:val="Compact"/>
+              <w:jc w:val="left"/>
+            </w:pPr>
+            <w:r>
+              <w:t xml:space="preserve">用冻结的容量快照</w:t>
+            </w:r>
+          </w:p>
+        </w:tc>
+        <w:tc>
+          <w:tcPr/>
+          <w:p>
+            <w:pPr>
+              <w:pStyle w:val="Compact"/>
+              <w:jc w:val="left"/>
+            </w:pPr>
+            <w:r>
+              <w:t xml:space="preserve">2026-09-27</w:t>
+            </w:r>
+          </w:p>
+        </w:tc>
+      </w:tr>
+      <w:tr>
+        <w:tc>
+          <w:tcPr/>
+          <w:p>
+            <w:pPr>
+              <w:pStyle w:val="Compact"/>
+              <w:jc w:val="left"/>
+            </w:pPr>
+            <w:r>
+              <w:t xml:space="preserve">方案中”任何来源都查不到学期”的课</w:t>
+            </w:r>
+          </w:p>
+        </w:tc>
+        <w:tc>
+          <w:tcPr/>
+          <w:p>
+            <w:pPr>
+              <w:pStyle w:val="Compact"/>
+              <w:jc w:val="left"/>
+            </w:pPr>
+            <w:r>
+              <w:t xml:space="preserve">14 门里 6 门</w:t>
+            </w:r>
+          </w:p>
+        </w:tc>
+        <w:tc>
+          <w:tcPr/>
+          <w:p>
+            <w:pPr>
+              <w:pStyle w:val="Compact"/>
+              <w:jc w:val="left"/>
+            </w:pPr>
+            <w:r>
+              <w:t xml:space="preserve">对冻结的官方导入做联接</w:t>
+            </w:r>
+          </w:p>
+        </w:tc>
+        <w:tc>
+          <w:tcPr/>
+          <w:p>
+            <w:pPr>
+              <w:pStyle w:val="Compact"/>
+              <w:jc w:val="left"/>
+            </w:pPr>
+            <w:r>
+              <w:t xml:space="preserve">2026-09-27</w:t>
+            </w:r>
+          </w:p>
+        </w:tc>
+      </w:tr>
+      <w:tr>
+        <w:tc>
+          <w:tcPr/>
+          <w:p>
+            <w:pPr>
+              <w:pStyle w:val="Compact"/>
+              <w:jc w:val="left"/>
+            </w:pPr>
+            <w:r>
+              <w:t xml:space="preserve">官方公开库 与 官方工作簿 的交集</w:t>
+            </w:r>
+          </w:p>
+        </w:tc>
+        <w:tc>
+          <w:tcPr/>
+          <w:p>
+            <w:pPr>
+              <w:pStyle w:val="Compact"/>
+              <w:jc w:val="left"/>
+            </w:pPr>
+            <w:r>
+              <w:t xml:space="preserve">212 / 341 门</w:t>
+            </w:r>
+          </w:p>
+        </w:tc>
+        <w:tc>
+          <w:tcPr/>
+          <w:p>
+            <w:pPr>
+              <w:pStyle w:val="Compact"/>
+              <w:jc w:val="left"/>
+            </w:pPr>
+            <w:r>
+              <w:t xml:space="preserve">按课程编码联接两份冻结件，均带哈希</w:t>
+            </w:r>
+          </w:p>
+        </w:tc>
+        <w:tc>
+          <w:tcPr/>
+          <w:p>
+            <w:pPr>
+              <w:pStyle w:val="Compact"/>
+              <w:jc w:val="left"/>
+            </w:pPr>
+            <w:r>
+              <w:t xml:space="preserve">2026-09-27</w:t>
+            </w:r>
+          </w:p>
+        </w:tc>
+      </w:tr>
+      <w:tr>
+        <w:tc>
+          <w:tcPr/>
+          <w:p>
+            <w:pPr>
+              <w:pStyle w:val="Compact"/>
+              <w:jc w:val="left"/>
+            </w:pPr>
+            <w:r>
+              <w:t xml:space="preserve">目标值</w:t>
+            </w:r>
+          </w:p>
+        </w:tc>
+        <w:tc>
+          <w:tcPr/>
+          <w:p>
+            <w:pPr>
+              <w:pStyle w:val="Compact"/>
+              <w:jc w:val="left"/>
+            </w:pPr>
+            <w:r>
+              <w:t xml:space="preserve">&lt; 5 分钟</w:t>
+            </w:r>
+          </w:p>
+        </w:tc>
+        <w:tc>
+          <w:tcPr/>
+          <w:p>
+            <w:pPr>
+              <w:pStyle w:val="Compact"/>
+              <w:jc w:val="left"/>
+            </w:pPr>
+            <w:r>
+              <w:t xml:space="preserve">同一份方案、同一套流程，两个数字才可比</w:t>
+            </w:r>
+          </w:p>
+        </w:tc>
+        <w:tc>
+          <w:tcPr/>
+          <w:p>
+            <w:pPr>
+              <w:pStyle w:val="Compact"/>
+              <w:jc w:val="left"/>
+            </w:pPr>
+            <w:r>
+              <w:t xml:space="preserve">—</w:t>
+            </w:r>
+          </w:p>
+        </w:tc>
+      </w:tr>
+      <w:tr>
+        <w:tc>
+          <w:tcPr/>
+          <w:p>
+            <w:pPr>
+              <w:pStyle w:val="Compact"/>
+              <w:jc w:val="left"/>
+            </w:pPr>
+            <w:r>
+              <w:t xml:space="preserve">失败的代价</w:t>
+            </w:r>
+          </w:p>
+        </w:tc>
+        <w:tc>
+          <w:tcPr/>
+          <w:p>
+            <w:pPr>
+              <w:pStyle w:val="Compact"/>
+              <w:jc w:val="left"/>
+            </w:pPr>
+            <w:r>
+              <w:t xml:space="preserve">冲突（要重排）／学分不够（对不上培养方案）／窗口里丢席位</w:t>
+            </w:r>
+          </w:p>
+        </w:tc>
+        <w:tc>
+          <w:tcPr/>
+          <w:p>
+            <w:pPr>
+              <w:pStyle w:val="Compact"/>
+              <w:jc w:val="left"/>
+            </w:pPr>
+            <w:r>
+              <w:t xml:space="preserve">只陈述后果，不编概率</w:t>
             </w:r>
           </w:p>
         </w:tc>
@@ -2346,6 +2683,277 @@
           <w:bCs/>
           <w:b/>
         </w:rPr>
+        <w:t xml:space="preserve">诚实性说明</w:t>
+      </w:r>
+      <w:r>
+        <w:t xml:space="preserve">：不声称”漏掉过几次冲突”。到目前为止每次改完都完整重查过，所以</w:t>
+      </w:r>
+      <w:r>
+        <w:rPr>
+          <w:bCs/>
+          <w:b/>
+        </w:rPr>
+        <w:t xml:space="preserve">没有已知的漏检</w:t>
+      </w:r>
+      <w:r>
+        <w:t xml:space="preserve">，代价就锚在”重复劳动”上，而不是编一个错误次数。</w:t>
+      </w:r>
+    </w:p>
+    <w:bookmarkEnd w:id="25"/>
+    <w:bookmarkStart w:id="26" w:name="不写软件的其他办法"/>
+    <w:p>
+      <w:pPr>
+        <w:pStyle w:val="Heading2"/>
+      </w:pPr>
+      <w:r>
+        <w:t xml:space="preserve">5. 不写软件的其他办法</w:t>
+      </w:r>
+    </w:p>
+    <w:tbl>
+      <w:tblPr>
+        <w:tblStyle w:val="Table"/>
+        <w:tblW w:type="pct" w:w="5000"/>
+        <w:tblLook w:firstRow="1" w:lastRow="0" w:firstColumn="0" w:lastColumn="0" w:noHBand="0" w:noVBand="0" w:val="0020"/>
+        <w:jc w:val="start"/>
+        <w:tblLayout w:type="fixed"/>
+        <w:tblBorders>
+          <w:top w:val="single" w:sz="4" w:color="9AA0AE"/>
+          <w:left w:val="single" w:sz="4" w:color="9AA0AE"/>
+          <w:bottom w:val="single" w:sz="4" w:color="9AA0AE"/>
+          <w:right w:val="single" w:sz="4" w:color="9AA0AE"/>
+          <w:insideH w:val="single" w:sz="4" w:color="9AA0AE"/>
+          <w:insideV w:val="single" w:sz="4" w:color="9AA0AE"/>
+        </w:tblBorders>
+        <w:tblW w:w="5000" w:type="pct"/>
+        <w:tblLayout w:type="autofit"/>
+      </w:tblPr>
+      <w:tblGrid>
+        <w:gridCol w:w="1980"/>
+        <w:gridCol w:w="1980"/>
+        <w:gridCol w:w="1980"/>
+        <w:gridCol w:w="1980"/>
+      </w:tblGrid>
+      <w:tr>
+        <w:trPr>
+          <w:tblHeader w:val="true"/>
+        </w:trPr>
+        <w:tc>
+          <w:tcPr>
+            <w:shd w:val="clear" w:fill="F1F2F6"/>
+          </w:tcPr>
+          <w:p>
+            <w:pPr>
+              <w:pStyle w:val="Compact"/>
+              <w:jc w:val="left"/>
+            </w:pPr>
+            <w:r>
+              <w:t xml:space="preserve">办法</w:t>
+            </w:r>
+          </w:p>
+        </w:tc>
+        <w:tc>
+          <w:tcPr>
+            <w:shd w:val="clear" w:fill="F1F2F6"/>
+          </w:tcPr>
+          <w:p>
+            <w:pPr>
+              <w:pStyle w:val="Compact"/>
+              <w:jc w:val="left"/>
+            </w:pPr>
+            <w:r>
+              <w:t xml:space="preserve">怎么做</w:t>
+            </w:r>
+          </w:p>
+        </w:tc>
+        <w:tc>
+          <w:tcPr>
+            <w:shd w:val="clear" w:fill="F1F2F6"/>
+          </w:tcPr>
+          <w:p>
+            <w:pPr>
+              <w:pStyle w:val="Compact"/>
+              <w:jc w:val="left"/>
+            </w:pPr>
+            <w:r>
+              <w:t xml:space="preserve">成本</w:t>
+            </w:r>
+          </w:p>
+        </w:tc>
+        <w:tc>
+          <w:tcPr>
+            <w:shd w:val="clear" w:fill="F1F2F6"/>
+          </w:tcPr>
+          <w:p>
+            <w:pPr>
+              <w:pStyle w:val="Compact"/>
+              <w:jc w:val="left"/>
+            </w:pPr>
+            <w:r>
+              <w:t xml:space="preserve">为什么不够（要有证据）</w:t>
+            </w:r>
+          </w:p>
+        </w:tc>
+      </w:tr>
+      <w:tr>
+        <w:tc>
+          <w:tcPr/>
+          <w:p>
+            <w:pPr>
+              <w:pStyle w:val="Compact"/>
+              <w:jc w:val="left"/>
+            </w:pPr>
+            <w:r>
+              <w:t xml:space="preserve">A. Excel 模板 + 打印出来的课表</w:t>
+            </w:r>
+          </w:p>
+        </w:tc>
+        <w:tc>
+          <w:tcPr/>
+          <w:p>
+            <w:pPr>
+              <w:pStyle w:val="Compact"/>
+              <w:jc w:val="left"/>
+            </w:pPr>
+            <w:r>
+              <w:t xml:space="preserve">固定表头，手工填、手工比</w:t>
+            </w:r>
+          </w:p>
+        </w:tc>
+        <w:tc>
+          <w:tcPr/>
+          <w:p>
+            <w:pPr>
+              <w:pStyle w:val="Compact"/>
+              <w:jc w:val="left"/>
+            </w:pPr>
+            <w:r>
+              <w:t xml:space="preserve">[待填]</w:t>
+            </w:r>
+          </w:p>
+        </w:tc>
+        <w:tc>
+          <w:tcPr/>
+          <w:p>
+            <w:pPr>
+              <w:pStyle w:val="Compact"/>
+              <w:jc w:val="left"/>
+            </w:pPr>
+            <w:r>
+              <w:t xml:space="preserve">三维规则仍然只存在于操作者脑子里；来源每年变、结构还互不一致（E3、E4、E5）</w:t>
+            </w:r>
+          </w:p>
+        </w:tc>
+      </w:tr>
+      <w:tr>
+        <w:tc>
+          <w:tcPr/>
+          <w:p>
+            <w:pPr>
+              <w:pStyle w:val="Compact"/>
+              <w:jc w:val="left"/>
+            </w:pPr>
+            <w:r>
+              <w:t xml:space="preserve">B. 现成的规划器/课表工具</w:t>
+            </w:r>
+          </w:p>
+        </w:tc>
+        <w:tc>
+          <w:tcPr/>
+          <w:p>
+            <w:pPr>
+              <w:pStyle w:val="Compact"/>
+              <w:jc w:val="left"/>
+            </w:pPr>
+            <w:r>
+              <w:t xml:space="preserve">搜一圈、试一下</w:t>
+            </w:r>
+          </w:p>
+        </w:tc>
+        <w:tc>
+          <w:tcPr/>
+          <w:p>
+            <w:pPr>
+              <w:pStyle w:val="Compact"/>
+              <w:jc w:val="left"/>
+            </w:pPr>
+            <w:r>
+              <w:t xml:space="preserve">[待填]</w:t>
+            </w:r>
+          </w:p>
+        </w:tc>
+        <w:tc>
+          <w:tcPr/>
+          <w:p>
+            <w:pPr>
+              <w:pStyle w:val="Compact"/>
+              <w:jc w:val="left"/>
+            </w:pPr>
+            <w:r>
+              <w:t xml:space="preserve">找到的都是面向”排课/教务”的；没找到能把这几个来源接起来、或带开课周的（检索记录：待补）</w:t>
+            </w:r>
+          </w:p>
+        </w:tc>
+      </w:tr>
+      <w:tr>
+        <w:tc>
+          <w:tcPr/>
+          <w:p>
+            <w:pPr>
+              <w:pStyle w:val="Compact"/>
+              <w:jc w:val="left"/>
+            </w:pPr>
+            <w:r>
+              <w:t xml:space="preserve">C. 本方案</w:t>
+            </w:r>
+          </w:p>
+        </w:tc>
+        <w:tc>
+          <w:tcPr/>
+          <w:p>
+            <w:pPr>
+              <w:pStyle w:val="Compact"/>
+              <w:jc w:val="left"/>
+            </w:pPr>
+            <w:r>
+              <w:t xml:space="preserve">冻结的联接输入 → 三维冲突检测 → 排课方案 + 独立的抢课顺序</w:t>
+            </w:r>
+          </w:p>
+        </w:tc>
+        <w:tc>
+          <w:tcPr/>
+          <w:p>
+            <w:pPr>
+              <w:pStyle w:val="Compact"/>
+              <w:jc w:val="left"/>
+            </w:pPr>
+            <w:r>
+              <w:t xml:space="preserve">一学期的活</w:t>
+            </w:r>
+          </w:p>
+        </w:tc>
+        <w:tc>
+          <w:tcPr/>
+          <w:p>
+            <w:pPr>
+              <w:pStyle w:val="Compact"/>
+              <w:jc w:val="left"/>
+            </w:pPr>
+            <w:r>
+              <w:t xml:space="preserve">—</w:t>
+            </w:r>
+          </w:p>
+        </w:tc>
+      </w:tr>
+    </w:tbl>
+    <w:p>
+      <w:pPr>
+        <w:pStyle w:val="BodyText"/>
+      </w:pPr>
+      <w:r>
+        <w:rPr>
+          <w:bCs/>
+          <w:b/>
+        </w:rPr>
         <w:t xml:space="preserve">为什么是 C 赢，而不是我偏好 C</w:t>
       </w:r>
       <w:r>
@@ -2377,8 +2985,8 @@
         <w:t xml:space="preserve">。</w:t>
       </w:r>
     </w:p>
-    <w:bookmarkEnd w:id="25"/>
-    <w:bookmarkStart w:id="26" w:name="场景"/>
+    <w:bookmarkEnd w:id="26"/>
+    <w:bookmarkStart w:id="27" w:name="场景"/>
     <w:p>
       <w:pPr>
         <w:pStyle w:val="Heading2"/>
@@ -2486,8 +3094,8 @@
         <w:t xml:space="preserve">——它破坏”先到先得”的公平，也大概违反平台规则，所以明确排除。其它：读别人的选课记录；编造班次数据让方案”看起来可行”；拿一份没冻结的旧快照当”当前”；把空的容量格子当成”座位不限”。</w:t>
       </w:r>
     </w:p>
-    <w:bookmarkEnd w:id="26"/>
-    <w:bookmarkStart w:id="27" w:name="本学期范围"/>
+    <w:bookmarkEnd w:id="27"/>
+    <w:bookmarkStart w:id="28" w:name="本学期范围"/>
     <w:p>
       <w:pPr>
         <w:pStyle w:val="Heading2"/>
@@ -2614,8 +3222,8 @@
         <w:t xml:space="preserve">。如果公开源哪天不再发布周次/节次，就把范围收窄成”课表一致性检查器”（仍然是三维的），而不是拿猜的数据顶上。</w:t>
       </w:r>
     </w:p>
-    <w:bookmarkEnd w:id="27"/>
-    <w:bookmarkStart w:id="28" w:name="ai-使用与来源核对日志"/>
+    <w:bookmarkEnd w:id="28"/>
+    <w:bookmarkStart w:id="29" w:name="ai-使用与来源核对日志"/>
     <w:p>
       <w:pPr>
         <w:pStyle w:val="Heading2"/>
@@ -2641,92 +3249,681 @@
         <w:t xml:space="preserve">ai/ai-use-log.md</w:t>
       </w:r>
       <w:r>
-        <w:t xml:space="preserve">。</w:t>
-      </w:r>
-      <w:r>
-        <w:rPr>
-          <w:bCs/>
-          <w:b/>
-        </w:rPr>
-        <w:t xml:space="preserve">有一条中间结论是被来源推翻的，而且我改了正文措辞</w:t>
-      </w:r>
-      <w:r>
-        <w:t xml:space="preserve">：早先的稿子写着”没有任何机读来源带开课周或星期节次”，后来官方公开库（以及第三方库）都证明这句是错的。另外，这个项目里</w:t>
-      </w:r>
-      <w:r>
-        <w:rPr>
-          <w:bCs/>
-          <w:b/>
-        </w:rPr>
-        <w:t xml:space="preserve">优先级的那两个维度是我自己提的，不是模型给的</w:t>
-      </w:r>
-      <w:r>
-        <w:t xml:space="preserve">。</w:t>
-      </w:r>
-    </w:p>
+        <w:t xml:space="preserve">。本节只列</w:t>
+      </w:r>
+      <w:r>
+        <w:rPr>
+          <w:bCs/>
+          <w:b/>
+        </w:rPr>
+        <w:t xml:space="preserve">可复核的实例</w:t>
+      </w:r>
+      <w:r>
+        <w:t xml:space="preserve">：AI（或 AI 参与产出的快照、脚本）说了什么、我拿什么来源核对、最后是接受还是被推翻。</w:t>
+      </w:r>
+    </w:p>
+    <w:tbl>
+      <w:tblPr>
+        <w:tblStyle w:val="Table"/>
+        <w:tblW w:type="pct" w:w="5000"/>
+        <w:tblLook w:firstRow="1" w:lastRow="0" w:firstColumn="0" w:lastColumn="0" w:noHBand="0" w:noVBand="0" w:val="0020"/>
+        <w:jc w:val="start"/>
+        <w:tblLayout w:type="fixed"/>
+        <w:tblBorders>
+          <w:top w:val="single" w:sz="4" w:color="9AA0AE"/>
+          <w:left w:val="single" w:sz="4" w:color="9AA0AE"/>
+          <w:bottom w:val="single" w:sz="4" w:color="9AA0AE"/>
+          <w:right w:val="single" w:sz="4" w:color="9AA0AE"/>
+          <w:insideH w:val="single" w:sz="4" w:color="9AA0AE"/>
+          <w:insideV w:val="single" w:sz="4" w:color="9AA0AE"/>
+        </w:tblBorders>
+        <w:tblW w:w="5000" w:type="pct"/>
+        <w:tblLayout w:type="autofit"/>
+      </w:tblPr>
+      <w:tblGrid>
+        <w:gridCol w:w="1980"/>
+        <w:gridCol w:w="1980"/>
+        <w:gridCol w:w="1980"/>
+        <w:gridCol w:w="1980"/>
+      </w:tblGrid>
+      <w:tr>
+        <w:trPr>
+          <w:tblHeader w:val="true"/>
+        </w:trPr>
+        <w:tc>
+          <w:tcPr>
+            <w:shd w:val="clear" w:fill="F1F2F6"/>
+          </w:tcPr>
+          <w:p>
+            <w:pPr>
+              <w:pStyle w:val="Compact"/>
+              <w:jc w:val="left"/>
+            </w:pPr>
+            <w:r>
+              <w:t xml:space="preserve">#</w:t>
+            </w:r>
+          </w:p>
+        </w:tc>
+        <w:tc>
+          <w:tcPr>
+            <w:shd w:val="clear" w:fill="F1F2F6"/>
+          </w:tcPr>
+          <w:p>
+            <w:pPr>
+              <w:pStyle w:val="Compact"/>
+              <w:jc w:val="left"/>
+            </w:pPr>
+            <w:r>
+              <w:t xml:space="preserve">中间结论（来自 AI 或 AI 参与产出的快照/脚本）</w:t>
+            </w:r>
+          </w:p>
+        </w:tc>
+        <w:tc>
+          <w:tcPr>
+            <w:shd w:val="clear" w:fill="F1F2F6"/>
+          </w:tcPr>
+          <w:p>
+            <w:pPr>
+              <w:pStyle w:val="Compact"/>
+              <w:jc w:val="left"/>
+            </w:pPr>
+            <w:r>
+              <w:t xml:space="preserve">我拿什么核对</w:t>
+            </w:r>
+          </w:p>
+        </w:tc>
+        <w:tc>
+          <w:tcPr>
+            <w:shd w:val="clear" w:fill="F1F2F6"/>
+          </w:tcPr>
+          <w:p>
+            <w:pPr>
+              <w:pStyle w:val="Compact"/>
+              <w:jc w:val="left"/>
+            </w:pPr>
+            <w:r>
+              <w:t xml:space="preserve">结论</w:t>
+            </w:r>
+          </w:p>
+        </w:tc>
+      </w:tr>
+      <w:tr>
+        <w:tc>
+          <w:tcPr/>
+          <w:p>
+            <w:pPr>
+              <w:pStyle w:val="Compact"/>
+              <w:jc w:val="left"/>
+            </w:pPr>
+            <w:r>
+              <w:t xml:space="preserve">1</w:t>
+            </w:r>
+          </w:p>
+        </w:tc>
+        <w:tc>
+          <w:tcPr/>
+          <w:p>
+            <w:pPr>
+              <w:pStyle w:val="Compact"/>
+              <w:jc w:val="left"/>
+            </w:pPr>
+            <w:r>
+              <w:t xml:space="preserve">快照：</w:t>
+            </w:r>
+            <w:r>
+              <w:t xml:space="preserve">“</w:t>
+            </w:r>
+            <w:r>
+              <w:t xml:space="preserve">海洋声学 周日第 5–7 节，每周</w:t>
+            </w:r>
+            <w:r>
+              <w:t xml:space="preserve">”</w:t>
+            </w:r>
+          </w:p>
+        </w:tc>
+        <w:tc>
+          <w:tcPr/>
+          <w:p>
+            <w:pPr>
+              <w:pStyle w:val="Compact"/>
+              <w:jc w:val="left"/>
+            </w:pPr>
+            <w:r>
+              <w:t xml:space="preserve">官方</w:t>
+            </w:r>
+            <w:r>
+              <w:t xml:space="preserve"> </w:t>
+            </w:r>
+            <w:r>
+              <w:rPr>
+                <w:rStyle w:val="VerbatimChar"/>
+              </w:rPr>
+              <w:t xml:space="preserve">coursetime/&lt;id&gt;</w:t>
+            </w:r>
+            <w:r>
+              <w:t xml:space="preserve"> </w:t>
+            </w:r>
+            <w:r>
+              <w:t xml:space="preserve">详情页</w:t>
+            </w:r>
+          </w:p>
+        </w:tc>
+        <w:tc>
+          <w:tcPr/>
+          <w:p>
+            <w:pPr>
+              <w:pStyle w:val="Compact"/>
+              <w:jc w:val="left"/>
+            </w:pPr>
+            <w:r>
+              <w:rPr>
+                <w:bCs/>
+                <w:b/>
+              </w:rPr>
+              <w:t xml:space="preserve">推翻</w:t>
+            </w:r>
+            <w:r>
+              <w:t xml:space="preserve">：周日仅第 3 周一次</w:t>
+            </w:r>
+          </w:p>
+        </w:tc>
+      </w:tr>
+      <w:tr>
+        <w:tc>
+          <w:tcPr/>
+          <w:p>
+            <w:pPr>
+              <w:pStyle w:val="Compact"/>
+              <w:jc w:val="left"/>
+            </w:pPr>
+            <w:r>
+              <w:t xml:space="preserve">2</w:t>
+            </w:r>
+          </w:p>
+        </w:tc>
+        <w:tc>
+          <w:tcPr/>
+          <w:p>
+            <w:pPr>
+              <w:pStyle w:val="Compact"/>
+              <w:jc w:val="left"/>
+            </w:pPr>
+            <w:r>
+              <w:t xml:space="preserve">快照：模式识别、自然辩证法的周六课”每周”</w:t>
+            </w:r>
+          </w:p>
+        </w:tc>
+        <w:tc>
+          <w:tcPr/>
+          <w:p>
+            <w:pPr>
+              <w:pStyle w:val="Compact"/>
+              <w:jc w:val="left"/>
+            </w:pPr>
+            <w:r>
+              <w:t xml:space="preserve">同上</w:t>
+            </w:r>
+          </w:p>
+        </w:tc>
+        <w:tc>
+          <w:tcPr/>
+          <w:p>
+            <w:pPr>
+              <w:pStyle w:val="Compact"/>
+              <w:jc w:val="left"/>
+            </w:pPr>
+            <w:r>
+              <w:rPr>
+                <w:bCs/>
+                <w:b/>
+              </w:rPr>
+              <w:t xml:space="preserve">推翻</w:t>
+            </w:r>
+            <w:r>
+              <w:t xml:space="preserve">：均仅第 6 周</w:t>
+            </w:r>
+          </w:p>
+        </w:tc>
+      </w:tr>
+      <w:tr>
+        <w:tc>
+          <w:tcPr/>
+          <w:p>
+            <w:pPr>
+              <w:pStyle w:val="Compact"/>
+              <w:jc w:val="left"/>
+            </w:pPr>
+            <w:r>
+              <w:t xml:space="preserve">3</w:t>
+            </w:r>
+          </w:p>
+        </w:tc>
+        <w:tc>
+          <w:tcPr/>
+          <w:p>
+            <w:pPr>
+              <w:pStyle w:val="Compact"/>
+              <w:jc w:val="left"/>
+            </w:pPr>
+            <w:r>
+              <w:t xml:space="preserve">“</w:t>
+            </w:r>
+            <w:r>
+              <w:t xml:space="preserve">开课周与星期节次只有第三方来源才有</w:t>
+            </w:r>
+            <w:r>
+              <w:t xml:space="preserve">”</w:t>
+            </w:r>
+          </w:p>
+        </w:tc>
+        <w:tc>
+          <w:tcPr/>
+          <w:p>
+            <w:pPr>
+              <w:pStyle w:val="Compact"/>
+              <w:jc w:val="left"/>
+            </w:pPr>
+            <w:r>
+              <w:t xml:space="preserve">官方公开库列表页 ＋ 详情页</w:t>
+            </w:r>
+          </w:p>
+        </w:tc>
+        <w:tc>
+          <w:tcPr/>
+          <w:p>
+            <w:pPr>
+              <w:pStyle w:val="Compact"/>
+              <w:jc w:val="left"/>
+            </w:pPr>
+            <w:r>
+              <w:rPr>
+                <w:bCs/>
+                <w:b/>
+              </w:rPr>
+              <w:t xml:space="preserve">推翻</w:t>
+            </w:r>
+            <w:r>
+              <w:t xml:space="preserve">：官方详情页就带这两项（本轮最大的一处更正）</w:t>
+            </w:r>
+          </w:p>
+        </w:tc>
+      </w:tr>
+      <w:tr>
+        <w:tc>
+          <w:tcPr/>
+          <w:p>
+            <w:pPr>
+              <w:pStyle w:val="Compact"/>
+              <w:jc w:val="left"/>
+            </w:pPr>
+            <w:r>
+              <w:t xml:space="preserve">4</w:t>
+            </w:r>
+          </w:p>
+        </w:tc>
+        <w:tc>
+          <w:tcPr/>
+          <w:p>
+            <w:pPr>
+              <w:pStyle w:val="Compact"/>
+              <w:jc w:val="left"/>
+            </w:pPr>
+            <w:r>
+              <w:t xml:space="preserve">我的脚本：</w:t>
+            </w:r>
+            <w:r>
+              <w:t xml:space="preserve">“</w:t>
+            </w:r>
+            <w:r>
+              <w:t xml:space="preserve">限选人数</w:t>
+            </w:r>
+            <w:r>
+              <w:t xml:space="preserve">”</w:t>
+            </w:r>
+            <w:r>
+              <w:t xml:space="preserve">列不是数字 → 报”容量字段异常”</w:t>
+            </w:r>
+          </w:p>
+        </w:tc>
+        <w:tc>
+          <w:tcPr/>
+          <w:p>
+            <w:pPr>
+              <w:pStyle w:val="Compact"/>
+              <w:jc w:val="left"/>
+            </w:pPr>
+            <w:r>
+              <w:t xml:space="preserve">回到这一列的</w:t>
+            </w:r>
+            <w:r>
+              <w:rPr>
+                <w:bCs/>
+                <w:b/>
+              </w:rPr>
+              <w:t xml:space="preserve">全部原始取值</w:t>
+            </w:r>
+            <w:r>
+              <w:t xml:space="preserve">看形态</w:t>
+            </w:r>
+          </w:p>
+        </w:tc>
+        <w:tc>
+          <w:tcPr/>
+          <w:p>
+            <w:pPr>
+              <w:pStyle w:val="Compact"/>
+              <w:jc w:val="left"/>
+            </w:pPr>
+            <w:r>
+              <w:rPr>
+                <w:bCs/>
+                <w:b/>
+              </w:rPr>
+              <w:t xml:space="preserve">推翻</w:t>
+            </w:r>
+            <w:r>
+              <w:t xml:space="preserve">：</w:t>
+            </w:r>
+            <w:r>
+              <w:rPr>
+                <w:rStyle w:val="VerbatimChar"/>
+              </w:rPr>
+              <w:t xml:space="preserve">/</w:t>
+            </w:r>
+            <w:r>
+              <w:t xml:space="preserve"> </w:t>
+            </w:r>
+            <w:r>
+              <w:t xml:space="preserve">是官方”不设限选人数”的写法——我把”不设限”读成了”缺数据”</w:t>
+            </w:r>
+          </w:p>
+        </w:tc>
+      </w:tr>
+      <w:tr>
+        <w:tc>
+          <w:tcPr/>
+          <w:p>
+            <w:pPr>
+              <w:pStyle w:val="Compact"/>
+              <w:jc w:val="left"/>
+            </w:pPr>
+            <w:r>
+              <w:t xml:space="preserve">5</w:t>
+            </w:r>
+          </w:p>
+        </w:tc>
+        <w:tc>
+          <w:tcPr/>
+          <w:p>
+            <w:pPr>
+              <w:pStyle w:val="Compact"/>
+              <w:jc w:val="left"/>
+            </w:pPr>
+            <w:r>
+              <w:t xml:space="preserve">脚本标注：</w:t>
+            </w:r>
+            <w:r>
+              <w:t xml:space="preserve">“</w:t>
+            </w:r>
+            <w:r>
+              <w:t xml:space="preserve">周次不连续 = 数据异常</w:t>
+            </w:r>
+            <w:r>
+              <w:t xml:space="preserve">”</w:t>
+            </w:r>
+          </w:p>
+        </w:tc>
+        <w:tc>
+          <w:tcPr/>
+          <w:p>
+            <w:pPr>
+              <w:pStyle w:val="Compact"/>
+              <w:jc w:val="left"/>
+            </w:pPr>
+            <w:r>
+              <w:t xml:space="preserve">统计全量分布</w:t>
+            </w:r>
+          </w:p>
+        </w:tc>
+        <w:tc>
+          <w:tcPr/>
+          <w:p>
+            <w:pPr>
+              <w:pStyle w:val="Compact"/>
+              <w:jc w:val="left"/>
+            </w:pPr>
+            <w:r>
+              <w:rPr>
+                <w:bCs/>
+                <w:b/>
+              </w:rPr>
+              <w:t xml:space="preserve">推翻</w:t>
+            </w:r>
+            <w:r>
+              <w:t xml:space="preserve">：561 段里</w:t>
+            </w:r>
+            <w:r>
+              <w:t xml:space="preserve"> </w:t>
+            </w:r>
+            <w:r>
+              <w:rPr>
+                <w:bCs/>
+                <w:b/>
+              </w:rPr>
+              <w:t xml:space="preserve">237 段（42%）</w:t>
+            </w:r>
+            <w:r>
+              <w:t xml:space="preserve">都不连续——课程本来就不是每周都上，这是常态</w:t>
+            </w:r>
+          </w:p>
+        </w:tc>
+      </w:tr>
+      <w:tr>
+        <w:tc>
+          <w:tcPr/>
+          <w:p>
+            <w:pPr>
+              <w:pStyle w:val="Compact"/>
+              <w:jc w:val="left"/>
+            </w:pPr>
+            <w:r>
+              <w:t xml:space="preserve">6</w:t>
+            </w:r>
+          </w:p>
+        </w:tc>
+        <w:tc>
+          <w:tcPr/>
+          <w:p>
+            <w:pPr>
+              <w:pStyle w:val="Compact"/>
+              <w:jc w:val="left"/>
+            </w:pPr>
+            <w:r>
+              <w:t xml:space="preserve">判断：</w:t>
+            </w:r>
+            <w:r>
+              <w:t xml:space="preserve">“</w:t>
+            </w:r>
+            <w:r>
+              <w:t xml:space="preserve">同一门课两份快照的已选人数不同 → 数据自相矛盾</w:t>
+            </w:r>
+            <w:r>
+              <w:t xml:space="preserve">”</w:t>
+            </w:r>
+          </w:p>
+        </w:tc>
+        <w:tc>
+          <w:tcPr/>
+          <w:p>
+            <w:pPr>
+              <w:pStyle w:val="Compact"/>
+              <w:jc w:val="left"/>
+            </w:pPr>
+            <w:r>
+              <w:t xml:space="preserve">挖出两份快照的导出时点</w:t>
+            </w:r>
+          </w:p>
+        </w:tc>
+        <w:tc>
+          <w:tcPr/>
+          <w:p>
+            <w:pPr>
+              <w:pStyle w:val="Compact"/>
+              <w:jc w:val="left"/>
+            </w:pPr>
+            <w:r>
+              <w:rPr>
+                <w:bCs/>
+                <w:b/>
+              </w:rPr>
+              <w:t xml:space="preserve">推翻</w:t>
+            </w:r>
+            <w:r>
+              <w:t xml:space="preserve">：9-08 13:07 与 9-27，时点差</w:t>
+            </w:r>
+            <w:r>
+              <w:t xml:space="preserve"> </w:t>
+            </w:r>
+            <w:r>
+              <w:rPr>
+                <w:bCs/>
+                <w:b/>
+              </w:rPr>
+              <w:t xml:space="preserve">19 天</w:t>
+            </w:r>
+          </w:p>
+        </w:tc>
+      </w:tr>
+      <w:tr>
+        <w:tc>
+          <w:tcPr/>
+          <w:p>
+            <w:pPr>
+              <w:pStyle w:val="Compact"/>
+              <w:jc w:val="left"/>
+            </w:pPr>
+            <w:r>
+              <w:t xml:space="preserve">7</w:t>
+            </w:r>
+          </w:p>
+        </w:tc>
+        <w:tc>
+          <w:tcPr/>
+          <w:p>
+            <w:pPr>
+              <w:pStyle w:val="Compact"/>
+              <w:jc w:val="left"/>
+            </w:pPr>
+            <w:r>
+              <w:t xml:space="preserve">官方工作簿”没有开课周 / 星期节次”</w:t>
+            </w:r>
+          </w:p>
+        </w:tc>
+        <w:tc>
+          <w:tcPr/>
+          <w:p>
+            <w:pPr>
+              <w:pStyle w:val="Compact"/>
+              <w:jc w:val="left"/>
+            </w:pPr>
+            <w:r>
+              <w:t xml:space="preserve">导入器自报的 4 条</w:t>
+            </w:r>
+            <w:r>
+              <w:t xml:space="preserve"> </w:t>
+            </w:r>
+            <w:r>
+              <w:rPr>
+                <w:rStyle w:val="VerbatimChar"/>
+              </w:rPr>
+              <w:t xml:space="preserve">importIssues</w:t>
+            </w:r>
+          </w:p>
+        </w:tc>
+        <w:tc>
+          <w:tcPr/>
+          <w:p>
+            <w:pPr>
+              <w:pStyle w:val="Compact"/>
+              <w:jc w:val="left"/>
+            </w:pPr>
+            <w:r>
+              <w:t xml:space="preserve">接受（列确实不存在）</w:t>
+            </w:r>
+          </w:p>
+        </w:tc>
+      </w:tr>
+      <w:tr>
+        <w:tc>
+          <w:tcPr/>
+          <w:p>
+            <w:pPr>
+              <w:pStyle w:val="Compact"/>
+              <w:jc w:val="left"/>
+            </w:pPr>
+            <w:r>
+              <w:t xml:space="preserve">8</w:t>
+            </w:r>
+          </w:p>
+        </w:tc>
+        <w:tc>
+          <w:tcPr/>
+          <w:p>
+            <w:pPr>
+              <w:pStyle w:val="Compact"/>
+              <w:jc w:val="left"/>
+            </w:pPr>
+            <w:r>
+              <w:t xml:space="preserve">第三方”考核方式”字段来源不明</w:t>
+            </w:r>
+          </w:p>
+        </w:tc>
+        <w:tc>
+          <w:tcPr/>
+          <w:p>
+            <w:pPr>
+              <w:pStyle w:val="Compact"/>
+              <w:jc w:val="left"/>
+            </w:pPr>
+            <w:r>
+              <w:t xml:space="preserve">反查官方三处 ＋ 工作簿字段 ＋ 第三方自己的说明</w:t>
+            </w:r>
+          </w:p>
+        </w:tc>
+        <w:tc>
+          <w:tcPr/>
+          <w:p>
+            <w:pPr>
+              <w:pStyle w:val="Compact"/>
+              <w:jc w:val="left"/>
+            </w:pPr>
+            <w:r>
+              <w:t xml:space="preserve">接受为</w:t>
+            </w:r>
+            <w:r>
+              <w:rPr>
+                <w:bCs/>
+                <w:b/>
+              </w:rPr>
+              <w:t xml:space="preserve">推断</w:t>
+            </w:r>
+            <w:r>
+              <w:t xml:space="preserve">：强证据但未直接看到 SEP 页面</w:t>
+            </w:r>
+          </w:p>
+        </w:tc>
+      </w:tr>
+    </w:tbl>
     <w:p>
       <w:pPr>
         <w:pStyle w:val="BodyText"/>
       </w:pPr>
       <w:r>
-        <w:t xml:space="preserve">今天又新增一条同类记录：我先把官方用</w:t>
-      </w:r>
-      <w:r>
-        <w:t xml:space="preserve"> </w:t>
-      </w:r>
-      <w:r>
-        <w:rPr>
-          <w:rStyle w:val="VerbatimChar"/>
-        </w:rPr>
-        <w:t xml:space="preserve">/</w:t>
-      </w:r>
-      <w:r>
-        <w:t xml:space="preserve"> </w:t>
-      </w:r>
-      <w:r>
-        <w:t xml:space="preserve">表示的”限选人数”当成了坏数据（报”容量字段非数字”），实际它是”</w:t>
-      </w:r>
-      <w:r>
-        <w:rPr>
-          <w:bCs/>
-          <w:b/>
-        </w:rPr>
-        <w:t xml:space="preserve">不设限选人数</w:t>
-      </w:r>
-      <w:r>
-        <w:t xml:space="preserve">”的意思——</w:t>
-      </w:r>
-      <w:r>
-        <w:rPr>
-          <w:bCs/>
-          <w:b/>
-        </w:rPr>
-        <w:t xml:space="preserve">把”不设限”读成了”缺数据”</w:t>
-      </w:r>
-      <w:r>
-        <w:t xml:space="preserve">，已修正。这条也写进了</w:t>
-      </w:r>
-      <w:r>
-        <w:t xml:space="preserve"> </w:t>
-      </w:r>
-      <w:r>
-        <w:rPr>
-          <w:rStyle w:val="VerbatimChar"/>
-        </w:rPr>
-        <w:t xml:space="preserve">docs/prototype-issues.md</w:t>
-      </w:r>
-      <w:r>
-        <w:t xml:space="preserve">。</w:t>
-      </w:r>
-    </w:p>
-    <w:bookmarkEnd w:id="28"/>
-    <w:bookmarkStart w:id="29" w:name="仓库与提交"/>
-    <w:p>
-      <w:pPr>
-        <w:pStyle w:val="Heading2"/>
-      </w:pPr>
-      <w:r>
-        <w:t xml:space="preserve">9. 仓库与提交</w:t>
+        <w:rPr>
+          <w:bCs/>
+          <w:b/>
+        </w:rPr>
+        <w:t xml:space="preserve">被否决的建议（同样要记）：</w:t>
       </w:r>
     </w:p>
     <w:p>
@@ -2738,14 +3935,17 @@
         <w:pStyle w:val="Compact"/>
       </w:pPr>
       <w:r>
-        <w:t xml:space="preserve">仓库：</w:t>
-      </w:r>
-      <w:r>
-        <w:rPr>
-          <w:bCs/>
-          <w:b/>
-        </w:rPr>
-        <w:t xml:space="preserve">[待填：仓库地址]</w:t>
+        <w:t xml:space="preserve">曾打算把”</w:t>
+      </w:r>
+      <w:r>
+        <w:rPr>
+          <w:bCs/>
+          <w:b/>
+        </w:rPr>
+        <w:t xml:space="preserve">自动抢课</w:t>
+      </w:r>
+      <w:r>
+        <w:t xml:space="preserve">”做成项目功能 → 否掉：破坏先到先得公平、很可能违反平台规则，改为明确非目标（见第 6、7 节）。</w:t>
       </w:r>
     </w:p>
     <w:p>
@@ -2757,13 +3957,7 @@
         <w:pStyle w:val="Compact"/>
       </w:pPr>
       <w:r>
-        <w:t xml:space="preserve">Commit / tag：</w:t>
-      </w:r>
-      <w:r>
-        <w:rPr>
-          <w:rStyle w:val="VerbatimChar"/>
-        </w:rPr>
-        <w:t xml:space="preserve">a1-v1</w:t>
+        <w:t xml:space="preserve">曾打算直接拿第三方快照当冲突检查的输入（不接官方源）→ 否掉：理由就是上表第 1、2 行的实例。</w:t>
       </w:r>
     </w:p>
     <w:p>
@@ -2775,76 +3969,105 @@
         <w:pStyle w:val="Compact"/>
       </w:pPr>
       <w:r>
-        <w:t xml:space="preserve">平台摘要（150–300 词）：</w:t>
-      </w:r>
-      <w:r>
-        <w:rPr>
-          <w:bCs/>
-          <w:b/>
-        </w:rPr>
-        <w:t xml:space="preserve">[待确认语言]</w:t>
-      </w:r>
-      <w:r>
-        <w:t xml:space="preserve">；仓库里的</w:t>
+        <w:t xml:space="preserve">曾打算用”历史开课数据”直接给抢课定优先级 → 暂缓：实测只有</w:t>
       </w:r>
       <w:r>
         <w:t xml:space="preserve"> </w:t>
       </w:r>
       <w:r>
         <w:rPr>
+          <w:bCs/>
+          <w:b/>
+        </w:rPr>
+        <w:t xml:space="preserve">20% 的课</w:t>
+      </w:r>
+      <w:r>
+        <w:t xml:space="preserve">能拿到 ≥2 年带容量的历史，而且”历史满员”的方向一致率虽然 89%，</w:t>
+      </w:r>
+      <w:r>
+        <w:rPr>
+          <w:bCs/>
+          <w:b/>
+        </w:rPr>
+        <w:t xml:space="preserve">基准发生率只有 7.6%</w:t>
+      </w:r>
+      <w:r>
+        <w:t xml:space="preserve">，等于什么都没说（详见</w:t>
+      </w:r>
+      <w:r>
+        <w:t xml:space="preserve"> </w:t>
+      </w:r>
+      <w:r>
+        <w:rPr>
           <w:rStyle w:val="VerbatimChar"/>
         </w:rPr>
-        <w:t xml:space="preserve">docs/submission-summary.md</w:t>
+        <w:t xml:space="preserve">docs/</w:t>
       </w:r>
       <w:r>
         <w:t xml:space="preserve"> </w:t>
       </w:r>
       <w:r>
-        <w:t xml:space="preserve">是英文版</w:t>
-      </w:r>
-    </w:p>
-    <w:p>
-      <w:pPr>
-        <w:numPr>
-          <w:ilvl w:val="0"/>
-          <w:numId w:val="1005"/>
-        </w:numPr>
-        <w:pStyle w:val="Compact"/>
-      </w:pPr>
-      <w:r>
-        <w:t xml:space="preserve">优先级模型：</w:t>
-      </w:r>
-      <w:r>
-        <w:rPr>
-          <w:rStyle w:val="VerbatimChar"/>
-        </w:rPr>
-        <w:t xml:space="preserve">docs/priority-rules.md</w:t>
-      </w:r>
-      <w:r>
-        <w:t xml:space="preserve">；数据来源权威链：</w:t>
-      </w:r>
-      <w:r>
-        <w:rPr>
-          <w:rStyle w:val="VerbatimChar"/>
-        </w:rPr>
-        <w:t xml:space="preserve">docs/data-authority.md</w:t>
-      </w:r>
-    </w:p>
-    <w:p>
-      <w:r>
-        <w:pict>
-          <v:rect style="width:0;height:1.5pt" o:hralign="center" o:hrstd="t" o:hr="t"/>
-        </w:pict>
+        <w:t xml:space="preserve">内相关记录）。</w:t>
+      </w:r>
+    </w:p>
+    <w:p>
+      <w:pPr>
+        <w:pStyle w:val="FirstParagraph"/>
+      </w:pPr>
+      <w:r>
+        <w:rPr>
+          <w:bCs/>
+          <w:b/>
+        </w:rPr>
+        <w:t xml:space="preserve">独立性</w:t>
+      </w:r>
+      <w:r>
+        <w:t xml:space="preserve">：上表每一行的核对都是</w:t>
+      </w:r>
+      <w:r>
+        <w:rPr>
+          <w:bCs/>
+          <w:b/>
+        </w:rPr>
+        <w:t xml:space="preserve">我自己重跑了一遍</w:t>
+      </w:r>
+      <w:r>
+        <w:t xml:space="preserve">（抓页面、解析、统计、比对），不是采信模型的转述。其中 3 条走的是”回原始文件/原始页面”的路径，2 条走的是”先看全量分布再判异常”的路径。</w:t>
+      </w:r>
+    </w:p>
+    <w:p>
+      <w:pPr>
+        <w:pStyle w:val="BodyText"/>
+      </w:pPr>
+      <w:r>
+        <w:rPr>
+          <w:bCs/>
+          <w:b/>
+        </w:rPr>
+        <w:t xml:space="preserve">另一个必须说明的边界</w:t>
+      </w:r>
+      <w:r>
+        <w:t xml:space="preserve">：优先级模型里的两个维度（不可延性与抢课紧迫度）</w:t>
+      </w:r>
+      <w:r>
+        <w:rPr>
+          <w:bCs/>
+          <w:b/>
+        </w:rPr>
+        <w:t xml:space="preserve">是我自己提的，不是模型给的</w:t>
+      </w:r>
+      <w:r>
+        <w:t xml:space="preserve">。</w:t>
       </w:r>
     </w:p>
     <w:bookmarkEnd w:id="29"/>
-    <w:bookmarkStart w:id="30" w:name="你要补-要确认的三件事"/>
+    <w:bookmarkStart w:id="30" w:name="仓库与提交"/>
     <w:p>
       <w:pPr>
         <w:pStyle w:val="Heading2"/>
       </w:pPr>
       <w:r>
-        <w:t xml:space="preserve">你要补 / 要确认的三件事</w:t>
+        <w:t xml:space="preserve">9. 仓库与提交</w:t>
       </w:r>
     </w:p>
     <w:p>
@@ -2856,24 +4079,14 @@
         <w:pStyle w:val="Compact"/>
       </w:pPr>
       <w:r>
-        <w:rPr>
-          <w:bCs/>
-          <w:b/>
-        </w:rPr>
-        <w:t xml:space="preserve">基线耗时</w:t>
-      </w:r>
-      <w:r>
-        <w:t xml:space="preserve">（第 4 节表格第一行）：拿 2026-09-15 那版方案，手工完整查一遍冲突，</w:t>
-      </w:r>
-      <w:r>
-        <w:rPr>
-          <w:bCs/>
-          <w:b/>
-        </w:rPr>
-        <w:t xml:space="preserve">掐表跑 3 次取平均</w:t>
-      </w:r>
-      <w:r>
-        <w:t xml:space="preserve">。这个数字必须你亲手测——它在评分里属于”执行与可复现”，我编不了。</w:t>
+        <w:t xml:space="preserve">仓库：</w:t>
+      </w:r>
+      <w:r>
+        <w:rPr>
+          <w:bCs/>
+          <w:b/>
+        </w:rPr>
+        <w:t xml:space="preserve">[待填：仓库地址]</w:t>
       </w:r>
     </w:p>
     <w:p>
@@ -2885,57 +4098,13 @@
         <w:pStyle w:val="Compact"/>
       </w:pPr>
       <w:r>
-        <w:rPr>
-          <w:bCs/>
-          <w:b/>
-        </w:rPr>
-        <w:t xml:space="preserve">“</w:t>
-      </w:r>
-      <w:r>
-        <w:rPr>
-          <w:bCs/>
-          <w:b/>
-        </w:rPr>
-        <w:t xml:space="preserve">没找到现成工具</w:t>
-      </w:r>
-      <w:r>
-        <w:rPr>
-          <w:bCs/>
-          <w:b/>
-        </w:rPr>
-        <w:t xml:space="preserve">”</w:t>
-      </w:r>
-      <w:r>
-        <w:rPr>
-          <w:bCs/>
-          <w:b/>
-        </w:rPr>
-        <w:t xml:space="preserve">的检索记录</w:t>
-      </w:r>
-      <w:r>
-        <w:t xml:space="preserve">：需要</w:t>
-      </w:r>
-      <w:r>
-        <w:rPr>
-          <w:bCs/>
-          <w:b/>
-        </w:rPr>
-        <w:t xml:space="preserve">检索式 + 日期 + 结果</w:t>
-      </w:r>
-      <w:r>
-        <w:t xml:space="preserve">才能支撑这个否定性主张。你搜过什么、在哪个引擎、看到什么，一句话一条就行，我整理进</w:t>
-      </w:r>
-      <w:r>
-        <w:t xml:space="preserve"> </w:t>
+        <w:t xml:space="preserve">Commit / tag：</w:t>
       </w:r>
       <w:r>
         <w:rPr>
           <w:rStyle w:val="VerbatimChar"/>
         </w:rPr>
-        <w:t xml:space="preserve">raw/search-log.md</w:t>
-      </w:r>
-      <w:r>
-        <w:t xml:space="preserve">。</w:t>
+        <w:t xml:space="preserve">a1-v1</w:t>
       </w:r>
     </w:p>
     <w:p>
@@ -2947,6 +4116,178 @@
         <w:pStyle w:val="Compact"/>
       </w:pPr>
       <w:r>
+        <w:t xml:space="preserve">平台摘要（150–300 词）：</w:t>
+      </w:r>
+      <w:r>
+        <w:rPr>
+          <w:bCs/>
+          <w:b/>
+        </w:rPr>
+        <w:t xml:space="preserve">[待确认语言]</w:t>
+      </w:r>
+      <w:r>
+        <w:t xml:space="preserve">；仓库里的</w:t>
+      </w:r>
+      <w:r>
+        <w:t xml:space="preserve"> </w:t>
+      </w:r>
+      <w:r>
+        <w:rPr>
+          <w:rStyle w:val="VerbatimChar"/>
+        </w:rPr>
+        <w:t xml:space="preserve">docs/submission-summary.md</w:t>
+      </w:r>
+      <w:r>
+        <w:t xml:space="preserve"> </w:t>
+      </w:r>
+      <w:r>
+        <w:t xml:space="preserve">是英文版</w:t>
+      </w:r>
+    </w:p>
+    <w:p>
+      <w:pPr>
+        <w:numPr>
+          <w:ilvl w:val="0"/>
+          <w:numId w:val="1006"/>
+        </w:numPr>
+        <w:pStyle w:val="Compact"/>
+      </w:pPr>
+      <w:r>
+        <w:t xml:space="preserve">优先级模型：</w:t>
+      </w:r>
+      <w:r>
+        <w:rPr>
+          <w:rStyle w:val="VerbatimChar"/>
+        </w:rPr>
+        <w:t xml:space="preserve">docs/priority-rules.md</w:t>
+      </w:r>
+      <w:r>
+        <w:t xml:space="preserve">；数据来源权威链：</w:t>
+      </w:r>
+      <w:r>
+        <w:rPr>
+          <w:rStyle w:val="VerbatimChar"/>
+        </w:rPr>
+        <w:t xml:space="preserve">docs/data-authority.md</w:t>
+      </w:r>
+    </w:p>
+    <w:p>
+      <w:r>
+        <w:pict>
+          <v:rect style="width:0;height:1.5pt" o:hralign="center" o:hrstd="t" o:hr="t"/>
+        </w:pict>
+      </w:r>
+    </w:p>
+    <w:bookmarkEnd w:id="30"/>
+    <w:bookmarkStart w:id="31" w:name="你要补-要确认的三件事"/>
+    <w:p>
+      <w:pPr>
+        <w:pStyle w:val="Heading2"/>
+      </w:pPr>
+      <w:r>
+        <w:t xml:space="preserve">你要补 / 要确认的三件事</w:t>
+      </w:r>
+    </w:p>
+    <w:p>
+      <w:pPr>
+        <w:numPr>
+          <w:ilvl w:val="0"/>
+          <w:numId w:val="1007"/>
+        </w:numPr>
+        <w:pStyle w:val="Compact"/>
+      </w:pPr>
+      <w:r>
+        <w:rPr>
+          <w:bCs/>
+          <w:b/>
+        </w:rPr>
+        <w:t xml:space="preserve">基线耗时</w:t>
+      </w:r>
+      <w:r>
+        <w:t xml:space="preserve">（第 4 节表格第一行）：拿 2026-09-15 那版方案，手工完整查一遍冲突，</w:t>
+      </w:r>
+      <w:r>
+        <w:rPr>
+          <w:bCs/>
+          <w:b/>
+        </w:rPr>
+        <w:t xml:space="preserve">掐表跑 3 次取平均</w:t>
+      </w:r>
+      <w:r>
+        <w:t xml:space="preserve">。这个数字必须你亲手测——它在评分里属于”执行与可复现”，我编不了。</w:t>
+      </w:r>
+    </w:p>
+    <w:p>
+      <w:pPr>
+        <w:numPr>
+          <w:ilvl w:val="0"/>
+          <w:numId w:val="1007"/>
+        </w:numPr>
+        <w:pStyle w:val="Compact"/>
+      </w:pPr>
+      <w:r>
+        <w:rPr>
+          <w:bCs/>
+          <w:b/>
+        </w:rPr>
+        <w:t xml:space="preserve">“</w:t>
+      </w:r>
+      <w:r>
+        <w:rPr>
+          <w:bCs/>
+          <w:b/>
+        </w:rPr>
+        <w:t xml:space="preserve">没找到现成工具</w:t>
+      </w:r>
+      <w:r>
+        <w:rPr>
+          <w:bCs/>
+          <w:b/>
+        </w:rPr>
+        <w:t xml:space="preserve">”</w:t>
+      </w:r>
+      <w:r>
+        <w:rPr>
+          <w:bCs/>
+          <w:b/>
+        </w:rPr>
+        <w:t xml:space="preserve">的检索记录</w:t>
+      </w:r>
+      <w:r>
+        <w:t xml:space="preserve">：需要</w:t>
+      </w:r>
+      <w:r>
+        <w:rPr>
+          <w:bCs/>
+          <w:b/>
+        </w:rPr>
+        <w:t xml:space="preserve">检索式 + 日期 + 结果</w:t>
+      </w:r>
+      <w:r>
+        <w:t xml:space="preserve">才能支撑这个否定性主张。你搜过什么、在哪个引擎、看到什么，一句话一条就行，我整理进</w:t>
+      </w:r>
+      <w:r>
+        <w:t xml:space="preserve"> </w:t>
+      </w:r>
+      <w:r>
+        <w:rPr>
+          <w:rStyle w:val="VerbatimChar"/>
+        </w:rPr>
+        <w:t xml:space="preserve">raw/search-log.md</w:t>
+      </w:r>
+      <w:r>
+        <w:t xml:space="preserve">。</w:t>
+      </w:r>
+    </w:p>
+    <w:p>
+      <w:pPr>
+        <w:numPr>
+          <w:ilvl w:val="0"/>
+          <w:numId w:val="1007"/>
+        </w:numPr>
+        <w:pStyle w:val="Compact"/>
+      </w:pPr>
+      <w:r>
         <w:rPr>
           <w:bCs/>
           <w:b/>
@@ -2975,8 +4316,8 @@
         <w:t xml:space="preserve">（表单写 150–300 词，看措辞更像英文）。如果是英文，我把英文摘要和英文正文一并同步——英文稿里那条过时结论也顺手改掉。</w:t>
       </w:r>
     </w:p>
-    <w:bookmarkEnd w:id="30"/>
     <w:bookmarkEnd w:id="31"/>
+    <w:bookmarkEnd w:id="32"/>
     <w:sectPr>
       <w:pgSz w:w="11906" w:h="16838"/>
       <w:pgMar w:left="1247" w:right="1247" w:top="1247" w:bottom="1247"/>
@@ -3293,6 +4634,9 @@
     <w:abstractNumId w:val="991"/>
   </w:num>
   <w:num w:numId="1006">
+    <w:abstractNumId w:val="991"/>
+  </w:num>
+  <w:num w:numId="1007">
     <w:abstractNumId w:val="99411"/>
     <w:lvlOverride w:ilvl="0">
       <w:startOverride w:val="1"/>

</xml_diff>